<commit_message>
Update report with Alex's sections
Intro, algorithm descriptions, methods, works cited
(still todo: conclusion)
</commit_message>
<xml_diff>
--- a/docs/Programming Project 2 Report.docx
+++ b/docs/Programming Project 2 Report.docx
@@ -78,6 +78,415 @@
       </w:r>
       <w:r>
         <w:t xml:space="preserve"> Alex</w:t>
+      </w:r>
+    </w:p>
+    <w:p>
+      <w:r>
+        <w:t xml:space="preserve">The aim of this project </w:t>
+      </w:r>
+      <w:r>
+        <w:t>is</w:t>
+      </w:r>
+      <w:r>
+        <w:t xml:space="preserve"> to </w:t>
+      </w:r>
+      <w:r>
+        <w:t xml:space="preserve">build a complete, data-driven experiment based on sorting algorithms. It is achieved by </w:t>
+      </w:r>
+      <w:r>
+        <w:t>implement</w:t>
+      </w:r>
+      <w:r>
+        <w:t>ing</w:t>
+      </w:r>
+      <w:r>
+        <w:t xml:space="preserve"> and test</w:t>
+      </w:r>
+      <w:r>
+        <w:t>ing</w:t>
+      </w:r>
+      <w:r>
+        <w:t xml:space="preserve"> various sorting algorithms on systematically generated input in such a way that the performance of </w:t>
+      </w:r>
+      <w:r>
+        <w:t xml:space="preserve">the </w:t>
+      </w:r>
+      <w:r>
+        <w:t xml:space="preserve">various algorithms </w:t>
+      </w:r>
+      <w:r>
+        <w:t>can</w:t>
+      </w:r>
+      <w:r>
+        <w:t xml:space="preserve"> be measured and compared. </w:t>
+      </w:r>
+      <w:r>
+        <w:t xml:space="preserve">There are </w:t>
+      </w:r>
+      <w:r>
+        <w:t>three</w:t>
+      </w:r>
+      <w:r>
+        <w:t xml:space="preserve"> key </w:t>
+      </w:r>
+      <w:r>
+        <w:t>building blocks</w:t>
+      </w:r>
+      <w:r>
+        <w:t xml:space="preserve"> necessary to achieve this</w:t>
+      </w:r>
+      <w:r>
+        <w:t xml:space="preserve">. </w:t>
+      </w:r>
+      <w:r>
+        <w:t>First,</w:t>
+      </w:r>
+      <w:r>
+        <w:t xml:space="preserve"> a variety of algorithms are required for testing. Second,</w:t>
+      </w:r>
+      <w:r>
+        <w:t xml:space="preserve"> a standard measure must be established and applied.</w:t>
+      </w:r>
+      <w:r>
+        <w:t xml:space="preserve"> </w:t>
+      </w:r>
+      <w:r>
+        <w:t>Third</w:t>
+      </w:r>
+      <w:r>
+        <w:t xml:space="preserve">, </w:t>
+      </w:r>
+      <w:r>
+        <w:t xml:space="preserve">test </w:t>
+      </w:r>
+      <w:r>
+        <w:t xml:space="preserve">input must be identical </w:t>
+      </w:r>
+      <w:r>
+        <w:t xml:space="preserve">and exhaustive </w:t>
+      </w:r>
+      <w:r>
+        <w:t xml:space="preserve">for each </w:t>
+      </w:r>
+      <w:r>
+        <w:t>algorithm</w:t>
+      </w:r>
+      <w:r>
+        <w:t>.</w:t>
+      </w:r>
+      <w:r>
+        <w:t xml:space="preserve"> Establishing these three fundamentals enables a subject and method for generating comparable data from which conclusions can be drawn.</w:t>
+      </w:r>
+    </w:p>
+    <w:p>
+      <w:pPr>
+        <w:pStyle w:val="Heading2"/>
+        <w:rPr>
+          <w:rFonts w:eastAsia="Times New Roman"/>
+        </w:rPr>
+      </w:pPr>
+      <w:r>
+        <w:rPr>
+          <w:rFonts w:eastAsia="Times New Roman"/>
+        </w:rPr>
+        <w:t>Algorithm Summar</w:t>
+      </w:r>
+      <w:r>
+        <w:rPr>
+          <w:rFonts w:eastAsia="Times New Roman"/>
+        </w:rPr>
+        <w:t>ies</w:t>
+      </w:r>
+    </w:p>
+    <w:p>
+      <w:r>
+        <w:t xml:space="preserve">The project considered four algorithms for sorting arrays: merge sort, quick sort, shaker sort, and heap sort. </w:t>
+      </w:r>
+      <w:r>
+        <w:t xml:space="preserve">A variety of algorithms is needed to establish a large enough dataset to draw meaningful conclusions: Which algorithms perform best? Worst? How does input affect performance? Is some input inherently best or worst for some or all algorithms? </w:t>
+      </w:r>
+      <w:r>
+        <w:t>Questions like these are more meaningfully answered the larger the number of subjects (algorithms) tested.</w:t>
+      </w:r>
+    </w:p>
+    <w:p>
+      <w:pPr>
+        <w:pStyle w:val="ListParagraph"/>
+        <w:numPr>
+          <w:ilvl w:val="0"/>
+          <w:numId w:val="8"/>
+        </w:numPr>
+      </w:pPr>
+      <w:r>
+        <w:t xml:space="preserve">Merge Sort </w:t>
+      </w:r>
+      <w:r>
+        <w:t xml:space="preserve">puts values in order by breaking the array of values in half, sorting each half, then merging the halves back together (merging element-by-element so the merged array is also sorted). The algorithm is applied recursively so that the first sort is on </w:t>
+      </w:r>
+      <w:r>
+        <w:t xml:space="preserve">a </w:t>
+      </w:r>
+      <w:r>
+        <w:t xml:space="preserve">arrays of </w:t>
+      </w:r>
+      <w:r>
+        <w:t>1</w:t>
+      </w:r>
+      <w:r>
+        <w:t xml:space="preserve"> item, then of </w:t>
+      </w:r>
+      <w:r>
+        <w:t>2</w:t>
+      </w:r>
+      <w:r>
+        <w:t xml:space="preserve"> items, then </w:t>
+      </w:r>
+      <w:r>
+        <w:t>4</w:t>
+      </w:r>
+      <w:r>
+        <w:t xml:space="preserve"> items, etc., until the original halves of the array are sorted and merged, producing a fully sorted array</w:t>
+      </w:r>
+      <w:r>
+        <w:t xml:space="preserve"> </w:t>
+      </w:r>
+      <w:r>
+        <w:t>(Sedgewick &amp; Wayne, 2011</w:t>
+      </w:r>
+      <w:r>
+        <w:t xml:space="preserve">, pp. </w:t>
+      </w:r>
+      <w:r>
+        <w:t>270-274</w:t>
+      </w:r>
+      <w:r>
+        <w:t xml:space="preserve">; </w:t>
+      </w:r>
+      <w:r>
+        <w:t>DSA Merge Sort Algorithm, n.d.</w:t>
+      </w:r>
+      <w:r>
+        <w:t>)</w:t>
+      </w:r>
+      <w:r>
+        <w:t>.</w:t>
+      </w:r>
+    </w:p>
+    <w:p>
+      <w:pPr>
+        <w:pStyle w:val="ListParagraph"/>
+        <w:numPr>
+          <w:ilvl w:val="0"/>
+          <w:numId w:val="8"/>
+        </w:numPr>
+      </w:pPr>
+      <w:r>
+        <w:t>Quick Sort</w:t>
+      </w:r>
+      <w:r>
+        <w:t xml:space="preserve"> works by </w:t>
+      </w:r>
+      <w:r>
+        <w:t>choosing an element in the array as a partition element and passing through the array from both ends, swapping an item from the right with an item from the left if those items are out of order when compared to the partition element (ex: if the partition element p = 5, and passing through the array from left to right finds an element i = 6 and passing through the array from right to left finds an element j = 2, i and j are swapped). This loop is completed until the index i moving from left to right passes the index j moving from right to left, at which point the partition element is placed at the crossing point. This process means all values less than p are to the left of p in the array, and all values larger are to the right of p. The process is then applied to the unsorted left and right halves recursively until the entire array is sorted</w:t>
+      </w:r>
+      <w:r>
+        <w:t xml:space="preserve"> </w:t>
+      </w:r>
+      <w:r>
+        <w:t>(Sedgewick &amp; Wayne, 2011</w:t>
+      </w:r>
+      <w:r>
+        <w:t xml:space="preserve">, pp. </w:t>
+      </w:r>
+      <w:r>
+        <w:t>288-292</w:t>
+      </w:r>
+      <w:r>
+        <w:t>)</w:t>
+      </w:r>
+      <w:r>
+        <w:t>.</w:t>
+      </w:r>
+    </w:p>
+    <w:p>
+      <w:pPr>
+        <w:pStyle w:val="ListParagraph"/>
+        <w:numPr>
+          <w:ilvl w:val="0"/>
+          <w:numId w:val="8"/>
+        </w:numPr>
+      </w:pPr>
+      <w:r>
+        <w:t>Shaker Sort</w:t>
+      </w:r>
+      <w:r>
+        <w:t>, also known as Cocktail Sort,</w:t>
+      </w:r>
+      <w:r>
+        <w:t xml:space="preserve"> passes through an array alternatively from left to right then from right to left. On the rightward passes, it compares the index element to the next element to the right, swaps if the next element is smaller, or </w:t>
+      </w:r>
+      <w:r>
+        <w:lastRenderedPageBreak/>
+        <w:t>otherwise advances to the next element. At the end of the first rightward pass, the largest element is in the right-most position. On leftward passes, the smaller elements are shifted left, so at the end of the first leftward pass the smallest element is the left-most position. The remaining portion of the array to be sorted is then iterated on until a pass results in no swaps</w:t>
+      </w:r>
+      <w:r>
+        <w:t xml:space="preserve"> </w:t>
+      </w:r>
+      <w:r>
+        <w:t>(Cocktail Sort Algorithm, n.d.)</w:t>
+      </w:r>
+      <w:r>
+        <w:t>.</w:t>
+      </w:r>
+    </w:p>
+    <w:p>
+      <w:pPr>
+        <w:pStyle w:val="ListParagraph"/>
+        <w:numPr>
+          <w:ilvl w:val="0"/>
+          <w:numId w:val="8"/>
+        </w:numPr>
+      </w:pPr>
+      <w:r>
+        <w:t>Heap Sort</w:t>
+      </w:r>
+      <w:r>
+        <w:t xml:space="preserve"> requires first </w:t>
+      </w:r>
+      <w:r>
+        <w:t>ordering</w:t>
+      </w:r>
+      <w:r>
+        <w:t xml:space="preserve"> the array into a binary heap, then subsequently sorting the array into either ascending or descending order (depending if the heap is maximum- or minimum-oriented) until </w:t>
+      </w:r>
+      <w:r>
+        <w:t xml:space="preserve">the array is fully sorted. </w:t>
+      </w:r>
+      <w:r>
+        <w:t>This is accomplished by swapping the first element of the heap with the last element, reducing the heap size by one (the now sorted last element), re-heapifying the remaining unsorted elements by sinking the new first element to its proper position, and repeating the process on the new heap until the heap size is one</w:t>
+      </w:r>
+      <w:r>
+        <w:t xml:space="preserve"> </w:t>
+      </w:r>
+      <w:r>
+        <w:t>(Sedgewick &amp; Wayne, 2011</w:t>
+      </w:r>
+      <w:r>
+        <w:t xml:space="preserve">, pp. 323-327; </w:t>
+      </w:r>
+      <w:r>
+        <w:t>Heap Sort Algorithm, n.d.)</w:t>
+      </w:r>
+      <w:r>
+        <w:t>.</w:t>
+      </w:r>
+    </w:p>
+    <w:p>
+      <w:pPr>
+        <w:pStyle w:val="Heading2"/>
+      </w:pPr>
+      <w:r>
+        <w:t>Methods</w:t>
+      </w:r>
+    </w:p>
+    <w:p>
+      <w:pPr>
+        <w:pStyle w:val="Heading3"/>
+      </w:pPr>
+      <w:r>
+        <w:t xml:space="preserve">Input: </w:t>
+      </w:r>
+      <w:r>
+        <w:t>Permutation</w:t>
+      </w:r>
+      <w:r>
+        <w:t xml:space="preserve"> Generation</w:t>
+      </w:r>
+    </w:p>
+    <w:p>
+      <w:r>
+        <w:t>To control the potential for variability in test inputs, identical, exhaustive input is required for every subject. Identical, exhaustive input ensures the algorithms are all tested against the same conditions and that no algorithm’s performance is advantaged or disadvantaged by a particular chance sequence that could be present in randomized inputs. By comparing the best, worst, and average performances of the algorithms on identical, exhaustive inputs, it is possible to establish whether an</w:t>
+      </w:r>
+      <w:r>
+        <w:t xml:space="preserve">y algorithm </w:t>
+      </w:r>
+      <w:r>
+        <w:t>is particularly better or worse a performer than the others</w:t>
+      </w:r>
+      <w:r>
+        <w:t>.</w:t>
+      </w:r>
+    </w:p>
+    <w:p>
+      <w:r>
+        <w:t>The permutation generator uses Heap’s Algorithm to generate and store all possible permutations of an array of size n, where the array is initialized in ascending order from 0 to n-1. As opposed to a recursive implementation, Heap’s algorithm does not generate permutations on subarrays while maintaining a fixed element of the larger array. Rather, it systematically produces each permutation from the previous one using a single swap and tracks swaps using an auxiliary counter array. It repeatedly swaps elements according to a rule based on comparison of the current index (the index itself, not the value stored there) and the value of the corresponding counter array element</w:t>
+      </w:r>
+      <w:r>
+        <w:t xml:space="preserve"> </w:t>
+      </w:r>
+      <w:r>
+        <w:t>(Permutations without Recursive Function Call, n.d.)</w:t>
+      </w:r>
+      <w:r>
+        <w:t>.</w:t>
+      </w:r>
+    </w:p>
+    <w:p>
+      <w:pPr>
+        <w:pStyle w:val="Heading3"/>
+      </w:pPr>
+      <w:r>
+        <w:t>Comparison Counting</w:t>
+      </w:r>
+    </w:p>
+    <w:p>
+      <w:r>
+        <w:t xml:space="preserve">A standard measure of performance is required in order to compare the algorithms fairly. Performance measures like </w:t>
+      </w:r>
+      <w:r>
+        <w:rPr>
+          <w:i/>
+          <w:iCs/>
+        </w:rPr>
+        <w:t>time to execute</w:t>
+      </w:r>
+      <w:r>
+        <w:t xml:space="preserve"> are useful, but they introduce difficult-to-control variables like hardware capacity and system warm-ups. Instead, this project builds </w:t>
+      </w:r>
+      <w:r>
+        <w:lastRenderedPageBreak/>
+        <w:t xml:space="preserve">a comparison counter into each algorithm. The comparison counter makes it possible after each algorithm sort operation to review how many comparisons the algorithm performed to </w:t>
+      </w:r>
+      <w:r>
+        <w:t>produce</w:t>
+      </w:r>
+      <w:r>
+        <w:t xml:space="preserve"> </w:t>
+      </w:r>
+      <w:r>
+        <w:t>the</w:t>
+      </w:r>
+      <w:r>
+        <w:t xml:space="preserve"> sorted output. A lower number of comparisons indicates a more efficient operation, and the key variability element – the input array – is easily controlled.</w:t>
+      </w:r>
+    </w:p>
+    <w:p>
+      <w:pPr>
+        <w:pStyle w:val="Heading2"/>
+      </w:pPr>
+      <w:bookmarkStart w:id="0" w:name="_Verification_Approach"/>
+      <w:bookmarkEnd w:id="0"/>
+      <w:r>
+        <w:t>Verification Approach</w:t>
+      </w:r>
+      <w:r>
+        <w:t xml:space="preserve"> </w:t>
+      </w:r>
+      <w:r>
+        <w:t>–</w:t>
+      </w:r>
+      <w:r>
+        <w:t xml:space="preserve"> Logan</w:t>
       </w:r>
     </w:p>
     <w:p>
@@ -95,7 +504,15 @@
         <w:rPr>
           <w:color w:val="4C94D8" w:themeColor="text2" w:themeTint="80"/>
         </w:rPr>
-        <w:t>Project Goal and Context</w:t>
+        <w:t> Clearly labeled tables for each n (4, 6, 8) and each algorithm: best 10, worst 10, average comparisons.</w:t>
+      </w:r>
+    </w:p>
+    <w:p>
+      <w:pPr>
+        <w:pStyle w:val="Heading2"/>
+      </w:pPr>
+      <w:r>
+        <w:t>Discussion</w:t>
       </w:r>
     </w:p>
     <w:p>
@@ -113,334 +530,7 @@
         <w:rPr>
           <w:color w:val="4C94D8" w:themeColor="text2" w:themeTint="80"/>
         </w:rPr>
-        <w:t>How do Comparisons relate to the Project Goal</w:t>
-      </w:r>
-      <w:r>
-        <w:rPr>
-          <w:color w:val="4C94D8" w:themeColor="text2" w:themeTint="80"/>
-        </w:rPr>
-        <w:t>?</w:t>
-      </w:r>
-    </w:p>
-    <w:p>
-      <w:pPr>
-        <w:pStyle w:val="ListParagraph"/>
-        <w:numPr>
-          <w:ilvl w:val="0"/>
-          <w:numId w:val="7"/>
-        </w:numPr>
-        <w:rPr>
-          <w:color w:val="4C94D8" w:themeColor="text2" w:themeTint="80"/>
-        </w:rPr>
-      </w:pPr>
-      <w:r>
-        <w:rPr>
-          <w:color w:val="4C94D8" w:themeColor="text2" w:themeTint="80"/>
-        </w:rPr>
-        <w:t>How do Permutations relate to the Project Goal</w:t>
-      </w:r>
-      <w:r>
-        <w:rPr>
-          <w:color w:val="4C94D8" w:themeColor="text2" w:themeTint="80"/>
-        </w:rPr>
-        <w:t>?</w:t>
-      </w:r>
-    </w:p>
-    <w:p>
-      <w:pPr>
-        <w:pStyle w:val="ListParagraph"/>
-        <w:numPr>
-          <w:ilvl w:val="0"/>
-          <w:numId w:val="7"/>
-        </w:numPr>
-        <w:rPr>
-          <w:color w:val="4C94D8" w:themeColor="text2" w:themeTint="80"/>
-        </w:rPr>
-      </w:pPr>
-      <w:r>
-        <w:rPr>
-          <w:color w:val="4C94D8" w:themeColor="text2" w:themeTint="80"/>
-        </w:rPr>
-        <w:t xml:space="preserve">Why </w:t>
-      </w:r>
-      <w:r>
-        <w:rPr>
-          <w:color w:val="4C94D8" w:themeColor="text2" w:themeTint="80"/>
-        </w:rPr>
-        <w:t>do we use</w:t>
-      </w:r>
-      <w:r>
-        <w:rPr>
-          <w:color w:val="4C94D8" w:themeColor="text2" w:themeTint="80"/>
-        </w:rPr>
-        <w:t xml:space="preserve"> the Algorithms </w:t>
-      </w:r>
-      <w:r>
-        <w:rPr>
-          <w:color w:val="4C94D8" w:themeColor="text2" w:themeTint="80"/>
-        </w:rPr>
-        <w:t>that we did?</w:t>
-      </w:r>
-    </w:p>
-    <w:p>
-      <w:pPr>
-        <w:pStyle w:val="Heading2"/>
-        <w:rPr>
-          <w:rFonts w:eastAsia="Times New Roman"/>
-        </w:rPr>
-      </w:pPr>
-      <w:r>
-        <w:rPr>
-          <w:rFonts w:eastAsia="Times New Roman"/>
-        </w:rPr>
-        <w:t xml:space="preserve">Algorithm Summary/Methods </w:t>
-      </w:r>
-      <w:r>
-        <w:rPr>
-          <w:rFonts w:eastAsia="Times New Roman"/>
-        </w:rPr>
-        <w:t>–</w:t>
-      </w:r>
-      <w:r>
-        <w:rPr>
-          <w:rFonts w:eastAsia="Times New Roman"/>
-        </w:rPr>
-        <w:t xml:space="preserve"> Alex</w:t>
-      </w:r>
-    </w:p>
-    <w:p>
-      <w:pPr>
-        <w:pStyle w:val="ListParagraph"/>
-        <w:numPr>
-          <w:ilvl w:val="0"/>
-          <w:numId w:val="7"/>
-        </w:numPr>
-        <w:rPr>
-          <w:color w:val="4C94D8" w:themeColor="text2" w:themeTint="80"/>
-        </w:rPr>
-      </w:pPr>
-      <w:r>
-        <w:rPr>
-          <w:color w:val="4C94D8" w:themeColor="text2" w:themeTint="80"/>
-        </w:rPr>
-        <w:t>Brief description of the sorting algorithms used</w:t>
-      </w:r>
-    </w:p>
-    <w:p>
-      <w:pPr>
-        <w:pStyle w:val="ListParagraph"/>
-        <w:numPr>
-          <w:ilvl w:val="1"/>
-          <w:numId w:val="7"/>
-        </w:numPr>
-        <w:rPr>
-          <w:color w:val="4C94D8" w:themeColor="text2" w:themeTint="80"/>
-        </w:rPr>
-      </w:pPr>
-      <w:proofErr w:type="spellStart"/>
-      <w:r>
-        <w:rPr>
-          <w:color w:val="4C94D8" w:themeColor="text2" w:themeTint="80"/>
-        </w:rPr>
-        <w:t>Mergesort</w:t>
-      </w:r>
-      <w:proofErr w:type="spellEnd"/>
-    </w:p>
-    <w:p>
-      <w:pPr>
-        <w:pStyle w:val="ListParagraph"/>
-        <w:numPr>
-          <w:ilvl w:val="1"/>
-          <w:numId w:val="7"/>
-        </w:numPr>
-        <w:rPr>
-          <w:color w:val="4C94D8" w:themeColor="text2" w:themeTint="80"/>
-        </w:rPr>
-      </w:pPr>
-      <w:r>
-        <w:rPr>
-          <w:color w:val="4C94D8" w:themeColor="text2" w:themeTint="80"/>
-        </w:rPr>
-        <w:t>Quicksort</w:t>
-      </w:r>
-    </w:p>
-    <w:p>
-      <w:pPr>
-        <w:pStyle w:val="ListParagraph"/>
-        <w:numPr>
-          <w:ilvl w:val="1"/>
-          <w:numId w:val="7"/>
-        </w:numPr>
-        <w:rPr>
-          <w:color w:val="4C94D8" w:themeColor="text2" w:themeTint="80"/>
-        </w:rPr>
-      </w:pPr>
-      <w:proofErr w:type="spellStart"/>
-      <w:r>
-        <w:rPr>
-          <w:color w:val="4C94D8" w:themeColor="text2" w:themeTint="80"/>
-        </w:rPr>
-        <w:t>Shakersort</w:t>
-      </w:r>
-      <w:proofErr w:type="spellEnd"/>
-    </w:p>
-    <w:p>
-      <w:pPr>
-        <w:pStyle w:val="ListParagraph"/>
-        <w:numPr>
-          <w:ilvl w:val="1"/>
-          <w:numId w:val="7"/>
-        </w:numPr>
-        <w:rPr>
-          <w:color w:val="4C94D8" w:themeColor="text2" w:themeTint="80"/>
-        </w:rPr>
-      </w:pPr>
-      <w:r>
-        <w:rPr>
-          <w:color w:val="4C94D8" w:themeColor="text2" w:themeTint="80"/>
-        </w:rPr>
-        <w:t>Heapsort</w:t>
-      </w:r>
-    </w:p>
-    <w:p>
-      <w:pPr>
-        <w:pStyle w:val="ListParagraph"/>
-        <w:numPr>
-          <w:ilvl w:val="0"/>
-          <w:numId w:val="7"/>
-        </w:numPr>
-        <w:rPr>
-          <w:color w:val="4C94D8" w:themeColor="text2" w:themeTint="80"/>
-        </w:rPr>
-      </w:pPr>
-      <w:r>
-        <w:rPr>
-          <w:color w:val="4C94D8" w:themeColor="text2" w:themeTint="80"/>
-        </w:rPr>
-        <w:t>How did you generate the permutations?</w:t>
-      </w:r>
-    </w:p>
-    <w:p>
-      <w:pPr>
-        <w:pStyle w:val="ListParagraph"/>
-        <w:numPr>
-          <w:ilvl w:val="0"/>
-          <w:numId w:val="7"/>
-        </w:numPr>
-        <w:rPr>
-          <w:color w:val="4C94D8" w:themeColor="text2" w:themeTint="80"/>
-        </w:rPr>
-      </w:pPr>
-      <w:r>
-        <w:rPr>
-          <w:color w:val="4C94D8" w:themeColor="text2" w:themeTint="80"/>
-        </w:rPr>
-        <w:t>How did you count the number of comparisons?</w:t>
-      </w:r>
-    </w:p>
-    <w:p>
-      <w:pPr>
-        <w:pStyle w:val="ListParagraph"/>
-        <w:numPr>
-          <w:ilvl w:val="0"/>
-          <w:numId w:val="7"/>
-        </w:numPr>
-        <w:rPr>
-          <w:color w:val="4C94D8" w:themeColor="text2" w:themeTint="80"/>
-        </w:rPr>
-      </w:pPr>
-      <w:r>
-        <w:rPr>
-          <w:color w:val="4C94D8" w:themeColor="text2" w:themeTint="80"/>
-        </w:rPr>
-        <w:t>How did you ensure fairness across the algorithms?</w:t>
-      </w:r>
-    </w:p>
-    <w:p>
-      <w:pPr>
-        <w:pStyle w:val="Heading2"/>
-      </w:pPr>
-      <w:bookmarkStart w:id="0" w:name="_Verification_Approach"/>
-      <w:bookmarkEnd w:id="0"/>
-      <w:r>
-        <w:t>V</w:t>
-      </w:r>
-      <w:r>
-        <w:t>erification Approach</w:t>
-      </w:r>
-      <w:r>
-        <w:t xml:space="preserve"> </w:t>
-      </w:r>
-      <w:r>
-        <w:t>–</w:t>
-      </w:r>
-      <w:r>
-        <w:t xml:space="preserve"> Logan</w:t>
-      </w:r>
-    </w:p>
-    <w:p>
-      <w:pPr>
-        <w:pStyle w:val="ListParagraph"/>
-        <w:numPr>
-          <w:ilvl w:val="0"/>
-          <w:numId w:val="7"/>
-        </w:numPr>
-        <w:rPr>
-          <w:color w:val="4C94D8" w:themeColor="text2" w:themeTint="80"/>
-        </w:rPr>
-      </w:pPr>
-      <w:r>
-        <w:rPr>
-          <w:color w:val="4C94D8" w:themeColor="text2" w:themeTint="80"/>
-        </w:rPr>
-        <w:t> </w:t>
-      </w:r>
-      <w:r>
-        <w:rPr>
-          <w:color w:val="4C94D8" w:themeColor="text2" w:themeTint="80"/>
-        </w:rPr>
-        <w:t>C</w:t>
-      </w:r>
-      <w:r>
-        <w:rPr>
-          <w:color w:val="4C94D8" w:themeColor="text2" w:themeTint="80"/>
-        </w:rPr>
-        <w:t>learly labeled tables for each n (4, 6, 8) and each algorithm: best 10, worst 10, average comparisons.</w:t>
-      </w:r>
-    </w:p>
-    <w:p>
-      <w:pPr>
-        <w:pStyle w:val="Heading2"/>
-      </w:pPr>
-      <w:r>
-        <w:t>D</w:t>
-      </w:r>
-      <w:r>
-        <w:t>iscussion</w:t>
-      </w:r>
-    </w:p>
-    <w:p>
-      <w:pPr>
-        <w:pStyle w:val="ListParagraph"/>
-        <w:numPr>
-          <w:ilvl w:val="0"/>
-          <w:numId w:val="7"/>
-        </w:numPr>
-        <w:rPr>
-          <w:color w:val="4C94D8" w:themeColor="text2" w:themeTint="80"/>
-        </w:rPr>
-      </w:pPr>
-      <w:r>
-        <w:rPr>
-          <w:color w:val="4C94D8" w:themeColor="text2" w:themeTint="80"/>
-        </w:rPr>
-        <w:t>F</w:t>
-      </w:r>
-      <w:r>
-        <w:rPr>
-          <w:color w:val="4C94D8" w:themeColor="text2" w:themeTint="80"/>
-        </w:rPr>
-        <w:t>ull paragraphs and defend your estimates logically using your measured data.</w:t>
+        <w:t>Full paragraphs and defend your estimates logically using your measured data.</w:t>
       </w:r>
     </w:p>
     <w:p>
@@ -463,16 +553,7 @@
           <w:sz w:val="28"/>
           <w:szCs w:val="28"/>
         </w:rPr>
-        <w:t>1</w:t>
-      </w:r>
-      <w:r>
-        <w:rPr>
-          <w:rFonts w:eastAsia="Aptos Display" w:cs="Times New Roman"/>
-          <w:color w:val="0B769F"/>
-          <w:sz w:val="28"/>
-          <w:szCs w:val="28"/>
-        </w:rPr>
-        <w:t xml:space="preserve"> </w:t>
+        <w:t xml:space="preserve">1 </w:t>
       </w:r>
       <w:r>
         <w:rPr>
@@ -555,16 +636,7 @@
           <w:sz w:val="28"/>
           <w:szCs w:val="28"/>
         </w:rPr>
-        <w:t>2</w:t>
-      </w:r>
-      <w:r>
-        <w:rPr>
-          <w:rFonts w:eastAsia="Aptos Display" w:cs="Times New Roman"/>
-          <w:color w:val="0B769F"/>
-          <w:sz w:val="28"/>
-          <w:szCs w:val="28"/>
-        </w:rPr>
-        <w:t xml:space="preserve"> </w:t>
+        <w:t xml:space="preserve">2 </w:t>
       </w:r>
       <w:r>
         <w:rPr>
@@ -634,16 +706,7 @@
           <w:sz w:val="28"/>
           <w:szCs w:val="28"/>
         </w:rPr>
-        <w:t>3</w:t>
-      </w:r>
-      <w:r>
-        <w:rPr>
-          <w:rFonts w:eastAsia="Aptos Display" w:cs="Times New Roman"/>
-          <w:color w:val="0B769F"/>
-          <w:sz w:val="28"/>
-          <w:szCs w:val="28"/>
-        </w:rPr>
-        <w:t xml:space="preserve"> </w:t>
+        <w:t xml:space="preserve">3 </w:t>
       </w:r>
       <w:r>
         <w:rPr>
@@ -724,16 +787,7 @@
           <w:sz w:val="28"/>
           <w:szCs w:val="28"/>
         </w:rPr>
-        <w:t>4</w:t>
-      </w:r>
-      <w:r>
-        <w:rPr>
-          <w:rFonts w:eastAsia="Aptos Display" w:cs="Times New Roman"/>
-          <w:color w:val="0B769F"/>
-          <w:sz w:val="28"/>
-          <w:szCs w:val="28"/>
-        </w:rPr>
-        <w:t xml:space="preserve"> </w:t>
+        <w:t xml:space="preserve">4 </w:t>
       </w:r>
       <w:r>
         <w:rPr>
@@ -799,10 +853,7 @@
         <w:pStyle w:val="Heading3"/>
       </w:pPr>
       <w:r>
-        <w:t>5</w:t>
-      </w:r>
-      <w:r>
-        <w:t xml:space="preserve"> </w:t>
+        <w:t xml:space="preserve">5 </w:t>
       </w:r>
       <w:r>
         <w:t xml:space="preserve">Project results differential </w:t>
@@ -837,10 +888,7 @@
         <w:pStyle w:val="Heading2"/>
       </w:pPr>
       <w:r>
-        <w:t>C</w:t>
-      </w:r>
-      <w:r>
-        <w:t>onclusion</w:t>
+        <w:t>Conclusion</w:t>
       </w:r>
       <w:r>
         <w:t xml:space="preserve"> </w:t>
@@ -893,6 +941,7 @@
         <w:pStyle w:val="Heading2"/>
       </w:pPr>
       <w:r>
+        <w:lastRenderedPageBreak/>
         <w:t>Summary of Work Done / Lessons Learned</w:t>
       </w:r>
       <w:r>
@@ -998,10 +1047,141 @@
       <w:bookmarkStart w:id="1" w:name="_Appendix_–_Part"/>
       <w:bookmarkEnd w:id="1"/>
       <w:r>
+        <w:lastRenderedPageBreak/>
         <w:t>Works Cited</w:t>
       </w:r>
     </w:p>
-    <w:p/>
+    <w:p>
+      <w:pPr>
+        <w:ind w:left="720" w:hanging="720"/>
+      </w:pPr>
+      <w:r>
+        <w:t xml:space="preserve">GeeksforGeeks. (n.d.). </w:t>
+      </w:r>
+      <w:r>
+        <w:rPr>
+          <w:i/>
+          <w:iCs/>
+        </w:rPr>
+        <w:t>Cocktail sort algorithm</w:t>
+      </w:r>
+      <w:r>
+        <w:t xml:space="preserve">. GeeksforGeeks. </w:t>
+      </w:r>
+      <w:hyperlink r:id="rId5" w:history="1">
+        <w:r>
+          <w:rPr>
+            <w:rStyle w:val="Hyperlink"/>
+          </w:rPr>
+          <w:t>https://www.geeksforgeeks.org/dsa/cocktail-sort/</w:t>
+        </w:r>
+      </w:hyperlink>
+    </w:p>
+    <w:p>
+      <w:pPr>
+        <w:ind w:left="720" w:hanging="720"/>
+      </w:pPr>
+      <w:r>
+        <w:t xml:space="preserve">W3Schools. (n.d.). </w:t>
+      </w:r>
+      <w:r>
+        <w:rPr>
+          <w:i/>
+          <w:iCs/>
+        </w:rPr>
+        <w:t>DSA merge sort algorithm</w:t>
+      </w:r>
+      <w:r>
+        <w:t xml:space="preserve">. W3Schools. </w:t>
+      </w:r>
+      <w:hyperlink r:id="rId6" w:history="1">
+        <w:r>
+          <w:rPr>
+            <w:rStyle w:val="Hyperlink"/>
+          </w:rPr>
+          <w:t>https://www.w3schools.com/dsa/dsa_algo_mergesort.php</w:t>
+        </w:r>
+      </w:hyperlink>
+    </w:p>
+    <w:p>
+      <w:pPr>
+        <w:ind w:left="720" w:hanging="720"/>
+      </w:pPr>
+      <w:r>
+        <w:t xml:space="preserve">GeeksforGeeks. (n.d.). </w:t>
+      </w:r>
+      <w:r>
+        <w:rPr>
+          <w:i/>
+          <w:iCs/>
+        </w:rPr>
+        <w:t>Heap sort algorithm</w:t>
+      </w:r>
+      <w:r>
+        <w:t xml:space="preserve">. GeeksforGeeks. </w:t>
+      </w:r>
+      <w:hyperlink r:id="rId7" w:history="1">
+        <w:r>
+          <w:rPr>
+            <w:rStyle w:val="Hyperlink"/>
+          </w:rPr>
+          <w:t>https://www.geeksforgeeks.org/dsa/heap-sort/</w:t>
+        </w:r>
+      </w:hyperlink>
+    </w:p>
+    <w:p>
+      <w:pPr>
+        <w:ind w:left="720" w:hanging="720"/>
+      </w:pPr>
+      <w:r>
+        <w:t xml:space="preserve">W3Tutorials. (n.d.). </w:t>
+      </w:r>
+      <w:r>
+        <w:rPr>
+          <w:i/>
+          <w:iCs/>
+        </w:rPr>
+        <w:t>Permutations without recursive function call</w:t>
+      </w:r>
+      <w:r>
+        <w:t xml:space="preserve">. W3Tutorials. </w:t>
+      </w:r>
+      <w:hyperlink r:id="rId8" w:history="1">
+        <w:r>
+          <w:rPr>
+            <w:rStyle w:val="Hyperlink"/>
+          </w:rPr>
+          <w:t>https://www.w3tutorials.net/blog/permutations-without-recursive-function-call/</w:t>
+        </w:r>
+      </w:hyperlink>
+    </w:p>
+    <w:p>
+      <w:pPr>
+        <w:ind w:left="720" w:hanging="720"/>
+      </w:pPr>
+      <w:r>
+        <w:t xml:space="preserve">Sedgewick, R., &amp; Wayne, K. (2011). </w:t>
+      </w:r>
+      <w:r>
+        <w:rPr>
+          <w:i/>
+          <w:iCs/>
+        </w:rPr>
+        <w:t>Algorithms</w:t>
+      </w:r>
+      <w:r>
+        <w:t xml:space="preserve"> (4th ed.). Addison</w:t>
+      </w:r>
+      <w:r>
+        <w:noBreakHyphen/>
+        <w:t>Wesley.</w:t>
+      </w:r>
+    </w:p>
+    <w:p>
+      <w:pPr>
+        <w:ind w:left="720" w:hanging="720"/>
+      </w:pPr>
+    </w:p>
     <w:sectPr>
       <w:pgSz w:w="12240" w:h="15840"/>
       <w:pgMar w:top="1440" w:right="1440" w:bottom="1440" w:left="1440" w:header="0" w:footer="0" w:gutter="0"/>
@@ -1394,6 +1574,119 @@
     </w:lvl>
   </w:abstractNum>
   <w:abstractNum w:abstractNumId="3" w15:restartNumberingAfterBreak="0">
+    <w:nsid w:val="1D0F01CD"/>
+    <w:multiLevelType w:val="hybridMultilevel"/>
+    <w:tmpl w:val="88942FD0"/>
+    <w:lvl w:ilvl="0" w:tplc="04090001">
+      <w:start w:val="1"/>
+      <w:numFmt w:val="bullet"/>
+      <w:lvlText w:val=""/>
+      <w:lvlJc w:val="left"/>
+      <w:pPr>
+        <w:ind w:left="720" w:hanging="360"/>
+      </w:pPr>
+      <w:rPr>
+        <w:rFonts w:ascii="Symbol" w:hAnsi="Symbol" w:hint="default"/>
+      </w:rPr>
+    </w:lvl>
+    <w:lvl w:ilvl="1" w:tplc="04090003" w:tentative="1">
+      <w:start w:val="1"/>
+      <w:numFmt w:val="bullet"/>
+      <w:lvlText w:val="o"/>
+      <w:lvlJc w:val="left"/>
+      <w:pPr>
+        <w:ind w:left="1440" w:hanging="360"/>
+      </w:pPr>
+      <w:rPr>
+        <w:rFonts w:ascii="Courier New" w:hAnsi="Courier New" w:cs="Courier New" w:hint="default"/>
+      </w:rPr>
+    </w:lvl>
+    <w:lvl w:ilvl="2" w:tplc="04090005" w:tentative="1">
+      <w:start w:val="1"/>
+      <w:numFmt w:val="bullet"/>
+      <w:lvlText w:val=""/>
+      <w:lvlJc w:val="left"/>
+      <w:pPr>
+        <w:ind w:left="2160" w:hanging="360"/>
+      </w:pPr>
+      <w:rPr>
+        <w:rFonts w:ascii="Wingdings" w:hAnsi="Wingdings" w:hint="default"/>
+      </w:rPr>
+    </w:lvl>
+    <w:lvl w:ilvl="3" w:tplc="04090001" w:tentative="1">
+      <w:start w:val="1"/>
+      <w:numFmt w:val="bullet"/>
+      <w:lvlText w:val=""/>
+      <w:lvlJc w:val="left"/>
+      <w:pPr>
+        <w:ind w:left="2880" w:hanging="360"/>
+      </w:pPr>
+      <w:rPr>
+        <w:rFonts w:ascii="Symbol" w:hAnsi="Symbol" w:hint="default"/>
+      </w:rPr>
+    </w:lvl>
+    <w:lvl w:ilvl="4" w:tplc="04090003" w:tentative="1">
+      <w:start w:val="1"/>
+      <w:numFmt w:val="bullet"/>
+      <w:lvlText w:val="o"/>
+      <w:lvlJc w:val="left"/>
+      <w:pPr>
+        <w:ind w:left="3600" w:hanging="360"/>
+      </w:pPr>
+      <w:rPr>
+        <w:rFonts w:ascii="Courier New" w:hAnsi="Courier New" w:cs="Courier New" w:hint="default"/>
+      </w:rPr>
+    </w:lvl>
+    <w:lvl w:ilvl="5" w:tplc="04090005" w:tentative="1">
+      <w:start w:val="1"/>
+      <w:numFmt w:val="bullet"/>
+      <w:lvlText w:val=""/>
+      <w:lvlJc w:val="left"/>
+      <w:pPr>
+        <w:ind w:left="4320" w:hanging="360"/>
+      </w:pPr>
+      <w:rPr>
+        <w:rFonts w:ascii="Wingdings" w:hAnsi="Wingdings" w:hint="default"/>
+      </w:rPr>
+    </w:lvl>
+    <w:lvl w:ilvl="6" w:tplc="04090001" w:tentative="1">
+      <w:start w:val="1"/>
+      <w:numFmt w:val="bullet"/>
+      <w:lvlText w:val=""/>
+      <w:lvlJc w:val="left"/>
+      <w:pPr>
+        <w:ind w:left="5040" w:hanging="360"/>
+      </w:pPr>
+      <w:rPr>
+        <w:rFonts w:ascii="Symbol" w:hAnsi="Symbol" w:hint="default"/>
+      </w:rPr>
+    </w:lvl>
+    <w:lvl w:ilvl="7" w:tplc="04090003" w:tentative="1">
+      <w:start w:val="1"/>
+      <w:numFmt w:val="bullet"/>
+      <w:lvlText w:val="o"/>
+      <w:lvlJc w:val="left"/>
+      <w:pPr>
+        <w:ind w:left="5760" w:hanging="360"/>
+      </w:pPr>
+      <w:rPr>
+        <w:rFonts w:ascii="Courier New" w:hAnsi="Courier New" w:cs="Courier New" w:hint="default"/>
+      </w:rPr>
+    </w:lvl>
+    <w:lvl w:ilvl="8" w:tplc="04090005" w:tentative="1">
+      <w:start w:val="1"/>
+      <w:numFmt w:val="bullet"/>
+      <w:lvlText w:val=""/>
+      <w:lvlJc w:val="left"/>
+      <w:pPr>
+        <w:ind w:left="6480" w:hanging="360"/>
+      </w:pPr>
+      <w:rPr>
+        <w:rFonts w:ascii="Wingdings" w:hAnsi="Wingdings" w:hint="default"/>
+      </w:rPr>
+    </w:lvl>
+  </w:abstractNum>
+  <w:abstractNum w:abstractNumId="4" w15:restartNumberingAfterBreak="0">
     <w:nsid w:val="240169C2"/>
     <w:multiLevelType w:val="hybridMultilevel"/>
     <w:tmpl w:val="38B019BC"/>
@@ -1506,7 +1799,7 @@
       </w:rPr>
     </w:lvl>
   </w:abstractNum>
-  <w:abstractNum w:abstractNumId="4" w15:restartNumberingAfterBreak="0">
+  <w:abstractNum w:abstractNumId="5" w15:restartNumberingAfterBreak="0">
     <w:nsid w:val="49212DF8"/>
     <w:multiLevelType w:val="multilevel"/>
     <w:tmpl w:val="9D126A04"/>
@@ -1646,7 +1939,7 @@
       </w:rPr>
     </w:lvl>
   </w:abstractNum>
-  <w:abstractNum w:abstractNumId="5" w15:restartNumberingAfterBreak="0">
+  <w:abstractNum w:abstractNumId="6" w15:restartNumberingAfterBreak="0">
     <w:nsid w:val="5CC11613"/>
     <w:multiLevelType w:val="multilevel"/>
     <w:tmpl w:val="36C0E8CA"/>
@@ -1762,7 +2055,7 @@
       </w:pPr>
     </w:lvl>
   </w:abstractNum>
-  <w:abstractNum w:abstractNumId="6" w15:restartNumberingAfterBreak="0">
+  <w:abstractNum w:abstractNumId="7" w15:restartNumberingAfterBreak="0">
     <w:nsid w:val="5F7844BE"/>
     <w:multiLevelType w:val="multilevel"/>
     <w:tmpl w:val="D5827D70"/>
@@ -1906,13 +2199,13 @@
     <w:abstractNumId w:val="0"/>
   </w:num>
   <w:num w:numId="2" w16cid:durableId="731082763">
-    <w:abstractNumId w:val="4"/>
+    <w:abstractNumId w:val="5"/>
   </w:num>
   <w:num w:numId="3" w16cid:durableId="695159543">
-    <w:abstractNumId w:val="6"/>
+    <w:abstractNumId w:val="7"/>
   </w:num>
   <w:num w:numId="4" w16cid:durableId="1049066517">
-    <w:abstractNumId w:val="5"/>
+    <w:abstractNumId w:val="6"/>
   </w:num>
   <w:num w:numId="5" w16cid:durableId="1974022282">
     <w:abstractNumId w:val="1"/>
@@ -1921,6 +2214,9 @@
     <w:abstractNumId w:val="2"/>
   </w:num>
   <w:num w:numId="7" w16cid:durableId="1481848779">
+    <w:abstractNumId w:val="4"/>
+  </w:num>
+  <w:num w:numId="8" w16cid:durableId="2111004331">
     <w:abstractNumId w:val="3"/>
   </w:num>
 </w:numbering>

</xml_diff>

<commit_message>
Added Discussions 1 & 4 to project report
</commit_message>
<xml_diff>
--- a/docs/Programming Project 2 Report.docx
+++ b/docs/Programming Project 2 Report.docx
@@ -226,6 +226,7 @@
       <w:r>
         <w:t xml:space="preserve">a </w:t>
       </w:r>
+      <w:proofErr w:type="gramStart"/>
       <w:r>
         <w:t xml:space="preserve">arrays of </w:t>
       </w:r>
@@ -233,7 +234,11 @@
         <w:t>1</w:t>
       </w:r>
       <w:r>
-        <w:t xml:space="preserve"> item, then of </w:t>
+        <w:t xml:space="preserve"> item</w:t>
+      </w:r>
+      <w:proofErr w:type="gramEnd"/>
+      <w:r>
+        <w:t xml:space="preserve">, then of </w:t>
       </w:r>
       <w:r>
         <w:t>2</w:t>
@@ -254,13 +259,7 @@
         <w:t>(Sedgewick &amp; Wayne, 2011</w:t>
       </w:r>
       <w:r>
-        <w:t xml:space="preserve">, pp. </w:t>
-      </w:r>
-      <w:r>
-        <w:t>270-274</w:t>
-      </w:r>
-      <w:r>
-        <w:t xml:space="preserve">; </w:t>
+        <w:t xml:space="preserve">, pp. 270-274; </w:t>
       </w:r>
       <w:r>
         <w:t>DSA Merge Sort Algorithm, n.d.</w:t>
@@ -287,7 +286,39 @@
         <w:t xml:space="preserve"> works by </w:t>
       </w:r>
       <w:r>
-        <w:t>choosing an element in the array as a partition element and passing through the array from both ends, swapping an item from the right with an item from the left if those items are out of order when compared to the partition element (ex: if the partition element p = 5, and passing through the array from left to right finds an element i = 6 and passing through the array from right to left finds an element j = 2, i and j are swapped). This loop is completed until the index i moving from left to right passes the index j moving from right to left, at which point the partition element is placed at the crossing point. This process means all values less than p are to the left of p in the array, and all values larger are to the right of p. The process is then applied to the unsorted left and right halves recursively until the entire array is sorted</w:t>
+        <w:t xml:space="preserve">choosing an element in the array as a partition element and passing through the array from both ends, swapping an item from the right with an item from the left if those items are out of order when compared to the partition element (ex: if the partition element p = 5, and passing through the array from left to right finds an element </w:t>
+      </w:r>
+      <w:proofErr w:type="spellStart"/>
+      <w:r>
+        <w:t>i</w:t>
+      </w:r>
+      <w:proofErr w:type="spellEnd"/>
+      <w:r>
+        <w:t xml:space="preserve"> = 6 and passing through the array from right to left finds an element j = 2, </w:t>
+      </w:r>
+      <w:proofErr w:type="spellStart"/>
+      <w:r>
+        <w:t>i</w:t>
+      </w:r>
+      <w:proofErr w:type="spellEnd"/>
+      <w:r>
+        <w:t xml:space="preserve"> and j are swapped). This loop is completed until the index </w:t>
+      </w:r>
+      <w:proofErr w:type="spellStart"/>
+      <w:r>
+        <w:t>i</w:t>
+      </w:r>
+      <w:proofErr w:type="spellEnd"/>
+      <w:r>
+        <w:t xml:space="preserve"> moving from left to right passes the index j moving from right to left, at which point the partition element is placed at the crossing point. This process means all values less than </w:t>
+      </w:r>
+      <w:proofErr w:type="spellStart"/>
+      <w:r>
+        <w:t>p are</w:t>
+      </w:r>
+      <w:proofErr w:type="spellEnd"/>
+      <w:r>
+        <w:t xml:space="preserve"> to the left of p in the array, and all values larger are to the right of p. The process is then applied to the unsorted left and right halves recursively until the entire array is sorted</w:t>
       </w:r>
       <w:r>
         <w:t xml:space="preserve"> </w:t>
@@ -296,10 +327,7 @@
         <w:t>(Sedgewick &amp; Wayne, 2011</w:t>
       </w:r>
       <w:r>
-        <w:t xml:space="preserve">, pp. </w:t>
-      </w:r>
-      <w:r>
-        <w:t>288-292</w:t>
+        <w:t>, pp. 288-292</w:t>
       </w:r>
       <w:r>
         <w:t>)</w:t>
@@ -323,11 +351,7 @@
         <w:t>, also known as Cocktail Sort,</w:t>
       </w:r>
       <w:r>
-        <w:t xml:space="preserve"> passes through an array alternatively from left to right then from right to left. On the rightward passes, it compares the index element to the next element to the right, swaps if the next element is smaller, or </w:t>
-      </w:r>
-      <w:r>
-        <w:lastRenderedPageBreak/>
-        <w:t>otherwise advances to the next element. At the end of the first rightward pass, the largest element is in the right-most position. On leftward passes, the smaller elements are shifted left, so at the end of the first leftward pass the smallest element is the left-most position. The remaining portion of the array to be sorted is then iterated on until a pass results in no swaps</w:t>
+        <w:t xml:space="preserve"> passes through an array alternatively from left to right then from right to left. On the rightward passes, it compares the index element to the next element to the right, swaps if the next element is smaller, or otherwise advances to the next element. At the end of the first rightward pass, the largest element is in the right-most position. On leftward passes, the smaller elements are shifted left, so at the end of the first leftward pass the smallest element is the left-most position. The remaining portion of the array to be sorted is then iterated on until a pass results in no swaps</w:t>
       </w:r>
       <w:r>
         <w:t xml:space="preserve"> </w:t>
@@ -357,13 +381,29 @@
         <w:t>ordering</w:t>
       </w:r>
       <w:r>
-        <w:t xml:space="preserve"> the array into a binary heap, then subsequently sorting the array into either ascending or descending order (depending if the heap is maximum- or minimum-oriented) until </w:t>
+        <w:t xml:space="preserve"> the array into a binary heap, then subsequently sorting the array into either ascending or descending order (</w:t>
+      </w:r>
+      <w:proofErr w:type="gramStart"/>
+      <w:r>
+        <w:t>depending</w:t>
+      </w:r>
+      <w:proofErr w:type="gramEnd"/>
+      <w:r>
+        <w:t xml:space="preserve"> if the heap is maximum- or minimum-oriented) until </w:t>
       </w:r>
       <w:r>
         <w:t xml:space="preserve">the array is fully sorted. </w:t>
       </w:r>
       <w:r>
-        <w:t>This is accomplished by swapping the first element of the heap with the last element, reducing the heap size by one (the now sorted last element), re-heapifying the remaining unsorted elements by sinking the new first element to its proper position, and repeating the process on the new heap until the heap size is one</w:t>
+        <w:t>This is accomplished by swapping the first element of the heap with the last element, reducing the heap size by one (the now sorted last element), re-</w:t>
+      </w:r>
+      <w:proofErr w:type="spellStart"/>
+      <w:r>
+        <w:t>heapifying</w:t>
+      </w:r>
+      <w:proofErr w:type="spellEnd"/>
+      <w:r>
+        <w:t xml:space="preserve"> the remaining unsorted elements by sinking the new first element to its proper position, and repeating the process on the new heap until the heap size is one</w:t>
       </w:r>
       <w:r>
         <w:t xml:space="preserve"> </w:t>
@@ -441,7 +481,15 @@
     </w:p>
     <w:p>
       <w:r>
-        <w:t xml:space="preserve">A standard measure of performance is required in order to compare the algorithms fairly. Performance measures like </w:t>
+        <w:t xml:space="preserve">A standard measure of performance is required </w:t>
+      </w:r>
+      <w:proofErr w:type="gramStart"/>
+      <w:r>
+        <w:t>in order to</w:t>
+      </w:r>
+      <w:proofErr w:type="gramEnd"/>
+      <w:r>
+        <w:t xml:space="preserve"> compare the algorithms fairly. Performance measures like </w:t>
       </w:r>
       <w:r>
         <w:rPr>
@@ -451,11 +499,7 @@
         <w:t>time to execute</w:t>
       </w:r>
       <w:r>
-        <w:t xml:space="preserve"> are useful, but they introduce difficult-to-control variables like hardware capacity and system warm-ups. Instead, this project builds </w:t>
-      </w:r>
-      <w:r>
-        <w:lastRenderedPageBreak/>
-        <w:t xml:space="preserve">a comparison counter into each algorithm. The comparison counter makes it possible after each algorithm sort operation to review how many comparisons the algorithm performed to </w:t>
+        <w:t xml:space="preserve"> are useful, but they introduce difficult-to-control variables like hardware capacity and system warm-ups. Instead, this project builds a comparison counter into each algorithm. The comparison counter makes it possible after each algorithm sort operation to review how many comparisons the algorithm performed to </w:t>
       </w:r>
       <w:r>
         <w:t>produce</w:t>
@@ -535,85 +579,547 @@
     </w:p>
     <w:p>
       <w:pPr>
+        <w:rPr>
+          <w:color w:val="4C94D8" w:themeColor="text2" w:themeTint="80"/>
+        </w:rPr>
+      </w:pPr>
+      <w:r>
+        <w:rPr>
+          <w:rFonts w:eastAsia="Aptos Display" w:cs="Times New Roman"/>
+          <w:color w:val="0B769F"/>
+          <w:sz w:val="28"/>
+          <w:szCs w:val="28"/>
+        </w:rPr>
+        <w:t xml:space="preserve">1 </w:t>
+      </w:r>
+      <w:r>
+        <w:rPr>
+          <w:rFonts w:eastAsia="Aptos Display" w:cs="Times New Roman"/>
+          <w:color w:val="0B769F"/>
+          <w:sz w:val="28"/>
+          <w:szCs w:val="28"/>
+        </w:rPr>
+        <w:t xml:space="preserve">Big-O, Big-Ω, and Big-Θ for each algorithm </w:t>
+      </w:r>
+      <w:r>
+        <w:rPr>
+          <w:rFonts w:eastAsia="Aptos Display" w:cs="Times New Roman"/>
+          <w:color w:val="0B769F"/>
+          <w:sz w:val="28"/>
+          <w:szCs w:val="28"/>
+        </w:rPr>
+        <w:t>–</w:t>
+      </w:r>
+      <w:r>
+        <w:rPr>
+          <w:rFonts w:eastAsia="Aptos Display" w:cs="Times New Roman"/>
+          <w:color w:val="0B769F"/>
+          <w:sz w:val="28"/>
+          <w:szCs w:val="28"/>
+        </w:rPr>
+        <w:t xml:space="preserve"> Julian</w:t>
+      </w:r>
+    </w:p>
+    <w:p>
+      <w:pPr>
+        <w:rPr>
+          <w:color w:val="4C94D8" w:themeColor="text2" w:themeTint="80"/>
+        </w:rPr>
+      </w:pPr>
+      <w:r>
+        <w:rPr>
+          <w:rFonts w:eastAsia="Aptos Display" w:cs="Times New Roman"/>
+          <w:color w:val="000000" w:themeColor="text1"/>
+          <w:sz w:val="26"/>
+          <w:szCs w:val="26"/>
+        </w:rPr>
+        <w:t>Merge Sort</w:t>
+      </w:r>
+    </w:p>
+    <w:p>
+      <w:pPr>
+        <w:rPr>
+          <w:color w:val="4C94D8" w:themeColor="text2" w:themeTint="80"/>
+        </w:rPr>
+      </w:pPr>
+      <w:r>
+        <w:rPr>
+          <w:rFonts w:eastAsia="Aptos Display" w:cs="Times New Roman"/>
+          <w:color w:val="000000" w:themeColor="text1"/>
+        </w:rPr>
+        <w:t xml:space="preserve">Merge Sort is always </w:t>
+      </w:r>
+      <w:proofErr w:type="spellStart"/>
+      <w:r>
+        <w:rPr>
+          <w:rFonts w:eastAsia="Aptos Display" w:cs="Times New Roman"/>
+          <w:i/>
+          <w:iCs/>
+          <w:color w:val="000000" w:themeColor="text1"/>
+        </w:rPr>
+        <w:t>nlog</w:t>
+      </w:r>
+      <w:proofErr w:type="spellEnd"/>
+      <w:r>
+        <w:rPr>
+          <w:rFonts w:eastAsia="Aptos Display" w:cs="Times New Roman"/>
+          <w:i/>
+          <w:iCs/>
+          <w:color w:val="000000" w:themeColor="text1"/>
+        </w:rPr>
+        <w:t>(n)</w:t>
+      </w:r>
+      <w:r>
+        <w:rPr>
+          <w:rFonts w:eastAsia="Aptos Display" w:cs="Times New Roman"/>
+          <w:color w:val="000000" w:themeColor="text1"/>
+        </w:rPr>
+        <w:t xml:space="preserve"> because the algorithm recursively divides the array in half with a total tree length of </w:t>
+      </w:r>
+      <w:r>
+        <w:rPr>
+          <w:rFonts w:eastAsia="Aptos Display" w:cs="Times New Roman"/>
+          <w:i/>
+          <w:iCs/>
+          <w:color w:val="000000" w:themeColor="text1"/>
+        </w:rPr>
+        <w:t>log(n)</w:t>
+      </w:r>
+      <w:r>
+        <w:rPr>
+          <w:rFonts w:eastAsia="Aptos Display" w:cs="Times New Roman"/>
+          <w:color w:val="000000" w:themeColor="text1"/>
+        </w:rPr>
+        <w:t>, as well as having to look through each element at every level.</w:t>
+      </w:r>
+    </w:p>
+    <w:p>
+      <w:pPr>
+        <w:rPr>
+          <w:color w:val="4C94D8" w:themeColor="text2" w:themeTint="80"/>
+        </w:rPr>
+      </w:pPr>
+      <w:r>
+        <w:rPr>
+          <w:rFonts w:eastAsia="Aptos Display" w:cs="Times New Roman"/>
+          <w:color w:val="000000" w:themeColor="text1"/>
+          <w:sz w:val="26"/>
+          <w:szCs w:val="26"/>
+        </w:rPr>
+        <w:t>Quick Sort</w:t>
+      </w:r>
+    </w:p>
+    <w:p>
+      <w:pPr>
+        <w:rPr>
+          <w:color w:val="4C94D8" w:themeColor="text2" w:themeTint="80"/>
+        </w:rPr>
+      </w:pPr>
+      <w:r>
+        <w:rPr>
+          <w:rFonts w:eastAsia="Aptos Display" w:cs="Times New Roman"/>
+          <w:color w:val="000000" w:themeColor="text1"/>
+        </w:rPr>
+        <w:t xml:space="preserve">Looking at the results from Quick Sort, the difference between comparisons from best to worst case is dramatic. The way Quick Sort starts is by picking one element, if that element is either the highest or lowest number within the array, then the result will have the most comparisons and the highest time complexity of Big-O </w:t>
+      </w:r>
+      <w:r>
+        <w:rPr>
+          <w:rFonts w:eastAsia="Aptos Display" w:cs="Times New Roman"/>
+          <w:i/>
+          <w:iCs/>
+          <w:color w:val="000000" w:themeColor="text1"/>
+        </w:rPr>
+        <w:t>(n</w:t>
+      </w:r>
+      <w:r>
+        <w:rPr>
+          <w:rFonts w:eastAsia="Aptos Display" w:cs="Times New Roman"/>
+          <w:i/>
+          <w:iCs/>
+          <w:color w:val="000000" w:themeColor="text1"/>
+          <w:vertAlign w:val="superscript"/>
+        </w:rPr>
+        <w:t>2</w:t>
+      </w:r>
+      <w:r>
+        <w:rPr>
+          <w:rFonts w:eastAsia="Aptos Display" w:cs="Times New Roman"/>
+          <w:i/>
+          <w:iCs/>
+          <w:color w:val="000000" w:themeColor="text1"/>
+        </w:rPr>
+        <w:t>)</w:t>
+      </w:r>
+      <w:r>
+        <w:rPr>
+          <w:rFonts w:eastAsia="Aptos Display" w:cs="Times New Roman"/>
+          <w:color w:val="000000" w:themeColor="text1"/>
+        </w:rPr>
+        <w:t>. If the element selected from the array is the median, then the algorithm will perform at its best due to it being able to partition elements at peak efficiently resulting in time complexity of Big-</w:t>
+      </w:r>
+      <w:r>
+        <w:rPr>
+          <w:rFonts w:eastAsia="Aptos Display" w:cs="Times New Roman"/>
+          <w:color w:val="000000" w:themeColor="text1"/>
+        </w:rPr>
+        <w:t xml:space="preserve"> </w:t>
+      </w:r>
+      <w:r>
+        <w:rPr>
+          <w:rFonts w:eastAsia="Aptos Display" w:cs="Times New Roman"/>
+          <w:color w:val="000000" w:themeColor="text1"/>
+        </w:rPr>
+        <w:t>Ω</w:t>
+      </w:r>
+      <w:r>
+        <w:rPr>
+          <w:rFonts w:eastAsia="Aptos Display" w:cs="Times New Roman"/>
+          <w:color w:val="000000" w:themeColor="text1"/>
+        </w:rPr>
+        <w:t xml:space="preserve"> </w:t>
+      </w:r>
+      <w:proofErr w:type="spellStart"/>
+      <w:r>
+        <w:rPr>
+          <w:rFonts w:eastAsia="Aptos Display" w:cs="Times New Roman"/>
+          <w:i/>
+          <w:iCs/>
+          <w:color w:val="000000" w:themeColor="text1"/>
+        </w:rPr>
+        <w:t>nlog</w:t>
+      </w:r>
+      <w:proofErr w:type="spellEnd"/>
+      <w:r>
+        <w:rPr>
+          <w:rFonts w:eastAsia="Aptos Display" w:cs="Times New Roman"/>
+          <w:i/>
+          <w:iCs/>
+          <w:color w:val="000000" w:themeColor="text1"/>
+        </w:rPr>
+        <w:t>(n)</w:t>
+      </w:r>
+      <w:r>
+        <w:rPr>
+          <w:rFonts w:eastAsia="Aptos Display" w:cs="Times New Roman"/>
+          <w:color w:val="000000" w:themeColor="text1"/>
+        </w:rPr>
+        <w:t xml:space="preserve">. Although the Big-O time complexity is </w:t>
+      </w:r>
+      <w:r>
+        <w:rPr>
+          <w:rFonts w:eastAsia="Aptos Display" w:cs="Times New Roman"/>
+          <w:i/>
+          <w:iCs/>
+          <w:color w:val="000000" w:themeColor="text1"/>
+        </w:rPr>
+        <w:t>n</w:t>
+      </w:r>
+      <w:r>
+        <w:rPr>
+          <w:rFonts w:eastAsia="Aptos Display" w:cs="Times New Roman"/>
+          <w:i/>
+          <w:iCs/>
+          <w:color w:val="000000" w:themeColor="text1"/>
+          <w:vertAlign w:val="superscript"/>
+        </w:rPr>
+        <w:t>2</w:t>
+      </w:r>
+      <w:r>
+        <w:rPr>
+          <w:rFonts w:eastAsia="Aptos Display" w:cs="Times New Roman"/>
+          <w:color w:val="000000" w:themeColor="text1"/>
+        </w:rPr>
+        <w:t xml:space="preserve">, this is only for the worst-case scenario and is </w:t>
+      </w:r>
+      <w:proofErr w:type="spellStart"/>
+      <w:r>
+        <w:rPr>
+          <w:rFonts w:eastAsia="Aptos Display" w:cs="Times New Roman"/>
+          <w:i/>
+          <w:iCs/>
+          <w:color w:val="000000" w:themeColor="text1"/>
+        </w:rPr>
+        <w:t>nlog</w:t>
+      </w:r>
+      <w:proofErr w:type="spellEnd"/>
+      <w:r>
+        <w:rPr>
+          <w:rFonts w:eastAsia="Aptos Display" w:cs="Times New Roman"/>
+          <w:i/>
+          <w:iCs/>
+          <w:color w:val="000000" w:themeColor="text1"/>
+        </w:rPr>
+        <w:t>(n)</w:t>
+      </w:r>
+      <w:r>
+        <w:rPr>
+          <w:rFonts w:eastAsia="Aptos Display" w:cs="Times New Roman"/>
+          <w:i/>
+          <w:iCs/>
+          <w:color w:val="000000" w:themeColor="text1"/>
+          <w:vertAlign w:val="superscript"/>
+        </w:rPr>
+        <w:t xml:space="preserve"> </w:t>
+      </w:r>
+      <w:r>
+        <w:rPr>
+          <w:rFonts w:eastAsia="Aptos Display" w:cs="Times New Roman"/>
+          <w:color w:val="000000" w:themeColor="text1"/>
+        </w:rPr>
+        <w:t>on every other account, resulting in Big-</w:t>
+      </w:r>
+      <w:r>
+        <w:t xml:space="preserve"> </w:t>
+      </w:r>
+      <w:r>
+        <w:rPr>
+          <w:rFonts w:eastAsia="Aptos Display" w:cs="Times New Roman"/>
+          <w:color w:val="000000" w:themeColor="text1"/>
+        </w:rPr>
+        <w:t>Θ</w:t>
+      </w:r>
+      <w:r>
+        <w:rPr>
+          <w:rFonts w:eastAsia="Aptos Display" w:cs="Times New Roman"/>
+          <w:color w:val="000000" w:themeColor="text1"/>
+        </w:rPr>
+        <w:t xml:space="preserve"> complexity of </w:t>
+      </w:r>
+      <w:proofErr w:type="spellStart"/>
+      <w:r>
+        <w:rPr>
+          <w:rFonts w:eastAsia="Aptos Display" w:cs="Times New Roman"/>
+          <w:i/>
+          <w:iCs/>
+          <w:color w:val="000000" w:themeColor="text1"/>
+        </w:rPr>
+        <w:t>nlog</w:t>
+      </w:r>
+      <w:proofErr w:type="spellEnd"/>
+      <w:r>
+        <w:rPr>
+          <w:rFonts w:eastAsia="Aptos Display" w:cs="Times New Roman"/>
+          <w:i/>
+          <w:iCs/>
+          <w:color w:val="000000" w:themeColor="text1"/>
+        </w:rPr>
+        <w:t>(n)</w:t>
+      </w:r>
+      <w:r>
+        <w:rPr>
+          <w:rFonts w:eastAsia="Aptos Display" w:cs="Times New Roman"/>
+          <w:color w:val="000000" w:themeColor="text1"/>
+        </w:rPr>
+        <w:t>.</w:t>
+      </w:r>
+    </w:p>
+    <w:p>
+      <w:pPr>
+        <w:rPr>
+          <w:color w:val="4C94D8" w:themeColor="text2" w:themeTint="80"/>
+        </w:rPr>
+      </w:pPr>
+      <w:r>
+        <w:rPr>
+          <w:rFonts w:eastAsia="Aptos Display" w:cs="Times New Roman"/>
+          <w:color w:val="000000" w:themeColor="text1"/>
+          <w:sz w:val="26"/>
+          <w:szCs w:val="26"/>
+        </w:rPr>
+        <w:t>Shaker Sort</w:t>
+      </w:r>
+    </w:p>
+    <w:p>
+      <w:pPr>
+        <w:rPr>
+          <w:color w:val="4C94D8" w:themeColor="text2" w:themeTint="80"/>
+        </w:rPr>
+      </w:pPr>
+      <w:r>
+        <w:rPr>
+          <w:rFonts w:eastAsia="Aptos Display" w:cs="Times New Roman"/>
+          <w:color w:val="000000" w:themeColor="text1"/>
+        </w:rPr>
+        <w:t xml:space="preserve">A trend can be seen from the results of the different </w:t>
+      </w:r>
+      <w:r>
+        <w:rPr>
+          <w:rFonts w:eastAsia="Aptos Display" w:cs="Times New Roman"/>
+          <w:i/>
+          <w:iCs/>
+          <w:color w:val="000000" w:themeColor="text1"/>
+        </w:rPr>
+        <w:t>n</w:t>
+      </w:r>
+      <w:r>
+        <w:rPr>
+          <w:rFonts w:eastAsia="Aptos Display" w:cs="Times New Roman"/>
+          <w:color w:val="000000" w:themeColor="text1"/>
+        </w:rPr>
+        <w:t xml:space="preserve"> values from the Shaker Sort, where the number of comparisons is nearly doubling with the exponential increase in element count of which the array sorts. The number of comparisons nearly doubling with every increment result in the notation of </w:t>
+      </w:r>
+      <w:r>
+        <w:rPr>
+          <w:rFonts w:eastAsia="Aptos Display" w:cs="Times New Roman"/>
+          <w:i/>
+          <w:iCs/>
+          <w:color w:val="000000" w:themeColor="text1"/>
+        </w:rPr>
+        <w:t>n</w:t>
+      </w:r>
+      <w:r>
+        <w:rPr>
+          <w:rFonts w:eastAsia="Aptos Display" w:cs="Times New Roman"/>
+          <w:i/>
+          <w:iCs/>
+          <w:color w:val="000000" w:themeColor="text1"/>
+          <w:vertAlign w:val="superscript"/>
+        </w:rPr>
+        <w:t>2</w:t>
+      </w:r>
+      <w:r>
+        <w:rPr>
+          <w:rFonts w:eastAsia="Aptos Display" w:cs="Times New Roman"/>
+          <w:color w:val="000000" w:themeColor="text1"/>
+        </w:rPr>
+        <w:t>. The results of best case and worst-case comparisons are proportional to each other. Shaker sort will go through and compare every element outside of what it’s already sorted even if the element is in fact already in the correct position, therefore the Big-O, Big-</w:t>
+      </w:r>
+      <w:r>
+        <w:t xml:space="preserve"> </w:t>
+      </w:r>
+      <w:r>
+        <w:rPr>
+          <w:rFonts w:eastAsia="Aptos Display" w:cs="Times New Roman"/>
+          <w:color w:val="000000" w:themeColor="text1"/>
+        </w:rPr>
+        <w:t>Ω</w:t>
+      </w:r>
+      <w:r>
+        <w:rPr>
+          <w:rFonts w:eastAsia="Aptos Display" w:cs="Times New Roman"/>
+          <w:color w:val="000000" w:themeColor="text1"/>
+        </w:rPr>
+        <w:t>, and Big-</w:t>
+      </w:r>
+      <w:r>
+        <w:t xml:space="preserve"> </w:t>
+      </w:r>
+      <w:r>
+        <w:rPr>
+          <w:rFonts w:eastAsia="Aptos Display" w:cs="Times New Roman"/>
+          <w:color w:val="000000" w:themeColor="text1"/>
+        </w:rPr>
+        <w:t>Θ</w:t>
+      </w:r>
+      <w:r>
+        <w:rPr>
+          <w:rFonts w:eastAsia="Aptos Display" w:cs="Times New Roman"/>
+          <w:color w:val="000000" w:themeColor="text1"/>
+        </w:rPr>
+        <w:t xml:space="preserve"> are all the same.</w:t>
+      </w:r>
+    </w:p>
+    <w:p>
+      <w:pPr>
         <w:keepNext/>
         <w:keepLines/>
         <w:spacing w:before="160" w:after="80"/>
+        <w:ind w:left="360"/>
         <w:outlineLvl w:val="2"/>
         <w:rPr>
           <w:rFonts w:eastAsia="Aptos Display" w:cs="Times New Roman"/>
-          <w:color w:val="0B769F"/>
-          <w:sz w:val="28"/>
-          <w:szCs w:val="28"/>
-        </w:rPr>
-      </w:pPr>
-      <w:r>
-        <w:rPr>
-          <w:rFonts w:eastAsia="Aptos Display" w:cs="Times New Roman"/>
-          <w:color w:val="0B769F"/>
-          <w:sz w:val="28"/>
-          <w:szCs w:val="28"/>
-        </w:rPr>
-        <w:t xml:space="preserve">1 </w:t>
-      </w:r>
-      <w:r>
-        <w:rPr>
-          <w:rFonts w:eastAsia="Aptos Display" w:cs="Times New Roman"/>
-          <w:color w:val="0B769F"/>
-          <w:sz w:val="28"/>
-          <w:szCs w:val="28"/>
-        </w:rPr>
-        <w:t>Big-O, Big-Ω, and Big-Θ for each algorithm</w:t>
-      </w:r>
-      <w:r>
-        <w:rPr>
-          <w:rFonts w:eastAsia="Aptos Display" w:cs="Times New Roman"/>
-          <w:color w:val="0B769F"/>
-          <w:sz w:val="28"/>
-          <w:szCs w:val="28"/>
-        </w:rPr>
-        <w:t xml:space="preserve"> </w:t>
-      </w:r>
-      <w:r>
-        <w:rPr>
-          <w:rFonts w:eastAsia="Aptos Display" w:cs="Times New Roman"/>
-          <w:color w:val="0B769F"/>
-          <w:sz w:val="28"/>
-          <w:szCs w:val="28"/>
-        </w:rPr>
-        <w:t>–</w:t>
-      </w:r>
-      <w:r>
-        <w:rPr>
-          <w:rFonts w:eastAsia="Aptos Display" w:cs="Times New Roman"/>
-          <w:color w:val="0B769F"/>
-          <w:sz w:val="28"/>
-          <w:szCs w:val="28"/>
-        </w:rPr>
-        <w:t xml:space="preserve"> Julian</w:t>
-      </w:r>
-    </w:p>
-    <w:p>
-      <w:pPr>
-        <w:pStyle w:val="ListParagraph"/>
+          <w:color w:val="000000" w:themeColor="text1"/>
+          <w:sz w:val="26"/>
+          <w:szCs w:val="26"/>
+        </w:rPr>
+      </w:pPr>
+      <w:r>
+        <w:rPr>
+          <w:rFonts w:eastAsia="Aptos Display" w:cs="Times New Roman"/>
+          <w:color w:val="000000" w:themeColor="text1"/>
+          <w:sz w:val="26"/>
+          <w:szCs w:val="26"/>
+        </w:rPr>
+        <w:t>Heap Sort</w:t>
+      </w:r>
+    </w:p>
+    <w:p>
+      <w:pPr>
         <w:keepNext/>
         <w:keepLines/>
-        <w:numPr>
-          <w:ilvl w:val="0"/>
-          <w:numId w:val="7"/>
-        </w:numPr>
         <w:spacing w:before="160" w:after="80"/>
+        <w:ind w:left="360"/>
         <w:outlineLvl w:val="2"/>
         <w:rPr>
           <w:rFonts w:eastAsia="Aptos Display" w:cs="Times New Roman"/>
-          <w:color w:val="4C94D8" w:themeColor="text2" w:themeTint="80"/>
-        </w:rPr>
-      </w:pPr>
-      <w:r>
-        <w:rPr>
-          <w:rFonts w:eastAsia="Aptos Display" w:cs="Times New Roman"/>
-          <w:color w:val="4C94D8" w:themeColor="text2" w:themeTint="80"/>
-        </w:rPr>
-        <w:t>Estimate Big-O, Big-Ω, and Big-Θ for each algorithm using your data (show reasoning, not just lookup)</w:t>
+          <w:color w:val="000000" w:themeColor="text1"/>
+        </w:rPr>
+      </w:pPr>
+      <w:r>
+        <w:rPr>
+          <w:rFonts w:eastAsia="Aptos Display" w:cs="Times New Roman"/>
+          <w:color w:val="000000" w:themeColor="text1"/>
+        </w:rPr>
+        <w:t xml:space="preserve">Every time </w:t>
+      </w:r>
+      <w:r>
+        <w:rPr>
+          <w:rFonts w:eastAsia="Aptos Display" w:cs="Times New Roman"/>
+          <w:i/>
+          <w:iCs/>
+          <w:color w:val="000000" w:themeColor="text1"/>
+        </w:rPr>
+        <w:t>n</w:t>
+      </w:r>
+      <w:r>
+        <w:rPr>
+          <w:rFonts w:eastAsia="Aptos Display" w:cs="Times New Roman"/>
+          <w:color w:val="000000" w:themeColor="text1"/>
+        </w:rPr>
+        <w:t xml:space="preserve"> increases, the number of times the algorithm must go through its branches and rearrange, as well as remove the maximum element to sort increases. Another element must be </w:t>
+      </w:r>
+      <w:proofErr w:type="spellStart"/>
+      <w:r>
+        <w:rPr>
+          <w:rFonts w:eastAsia="Aptos Display" w:cs="Times New Roman"/>
+          <w:color w:val="000000" w:themeColor="text1"/>
+        </w:rPr>
+        <w:t>heapified</w:t>
+      </w:r>
+      <w:proofErr w:type="spellEnd"/>
+      <w:r>
+        <w:rPr>
+          <w:rFonts w:eastAsia="Aptos Display" w:cs="Times New Roman"/>
+          <w:color w:val="000000" w:themeColor="text1"/>
+        </w:rPr>
+        <w:t xml:space="preserve"> and then arranged when sorting. Because the program must go through the entire heap multiple times to sort, it results in time </w:t>
+      </w:r>
+      <w:proofErr w:type="spellStart"/>
+      <w:r>
+        <w:rPr>
+          <w:rFonts w:eastAsia="Aptos Display" w:cs="Times New Roman"/>
+          <w:i/>
+          <w:iCs/>
+          <w:color w:val="000000" w:themeColor="text1"/>
+        </w:rPr>
+        <w:t>nlog</w:t>
+      </w:r>
+      <w:proofErr w:type="spellEnd"/>
+      <w:r>
+        <w:rPr>
+          <w:rFonts w:eastAsia="Aptos Display" w:cs="Times New Roman"/>
+          <w:i/>
+          <w:iCs/>
+          <w:color w:val="000000" w:themeColor="text1"/>
+        </w:rPr>
+        <w:t>(n)</w:t>
+      </w:r>
+      <w:r>
+        <w:rPr>
+          <w:rFonts w:eastAsia="Aptos Display" w:cs="Times New Roman"/>
+          <w:color w:val="000000" w:themeColor="text1"/>
+        </w:rPr>
+        <w:t xml:space="preserve"> for all cases.</w:t>
       </w:r>
     </w:p>
     <w:p>
@@ -830,19 +1336,264 @@
     </w:p>
     <w:p>
       <w:pPr>
+        <w:rPr>
+          <w:rFonts w:ascii="Aptos" w:eastAsia="Aptos Display" w:hAnsi="Aptos" w:cs="Times New Roman"/>
+          <w:color w:val="000000" w:themeColor="text1"/>
+          <w:sz w:val="26"/>
+          <w:szCs w:val="26"/>
+        </w:rPr>
+      </w:pPr>
+      <w:r>
+        <w:rPr>
+          <w:rFonts w:ascii="Aptos" w:eastAsia="Aptos Display" w:hAnsi="Aptos" w:cs="Times New Roman"/>
+          <w:color w:val="000000" w:themeColor="text1"/>
+          <w:sz w:val="26"/>
+          <w:szCs w:val="26"/>
+        </w:rPr>
+        <w:t>Best Case</w:t>
+      </w:r>
+    </w:p>
+    <w:p>
+      <w:pPr>
+        <w:rPr>
+          <w:rFonts w:ascii="Aptos" w:eastAsia="Aptos Display" w:hAnsi="Aptos" w:cs="Times New Roman"/>
+          <w:color w:val="000000" w:themeColor="text1"/>
+        </w:rPr>
+      </w:pPr>
+      <w:r>
+        <w:rPr>
+          <w:rFonts w:ascii="Aptos" w:eastAsia="Aptos Display" w:hAnsi="Aptos" w:cs="Times New Roman"/>
+          <w:color w:val="000000" w:themeColor="text1"/>
+        </w:rPr>
+        <w:t xml:space="preserve">The best algorithm to use with the best case would be Quick Sort. Both Merge Sort and Quick Sort have a time complexity of </w:t>
+      </w:r>
+      <w:proofErr w:type="spellStart"/>
+      <w:r>
+        <w:rPr>
+          <w:rFonts w:ascii="Aptos" w:eastAsia="Aptos Display" w:hAnsi="Aptos" w:cs="Times New Roman"/>
+          <w:i/>
+          <w:iCs/>
+          <w:color w:val="000000" w:themeColor="text1"/>
+        </w:rPr>
+        <w:t>nlog</w:t>
+      </w:r>
+      <w:proofErr w:type="spellEnd"/>
+      <w:r>
+        <w:rPr>
+          <w:rFonts w:ascii="Aptos" w:eastAsia="Aptos Display" w:hAnsi="Aptos" w:cs="Times New Roman"/>
+          <w:i/>
+          <w:iCs/>
+          <w:color w:val="000000" w:themeColor="text1"/>
+        </w:rPr>
+        <w:t>(n)</w:t>
+      </w:r>
+      <w:r>
+        <w:rPr>
+          <w:rFonts w:ascii="Aptos" w:eastAsia="Aptos Display" w:hAnsi="Aptos" w:cs="Times New Roman"/>
+          <w:i/>
+          <w:iCs/>
+          <w:color w:val="000000" w:themeColor="text1"/>
+        </w:rPr>
+        <w:t xml:space="preserve"> </w:t>
+      </w:r>
+      <w:r>
+        <w:rPr>
+          <w:rFonts w:ascii="Aptos" w:eastAsia="Aptos Display" w:hAnsi="Aptos" w:cs="Times New Roman"/>
+          <w:color w:val="000000" w:themeColor="text1"/>
+        </w:rPr>
+        <w:t>given Quick Sort is split evenly, but Quick Sort also sorts in place which allows for sorting multiple columns like in a database query. If Quick Sort is not split evenly, then Merge Sort would be more reliable than Quick Sort and be able to sort in ample time.</w:t>
+      </w:r>
+    </w:p>
+    <w:p>
+      <w:pPr>
+        <w:rPr>
+          <w:rFonts w:ascii="Aptos" w:eastAsia="Aptos Display" w:hAnsi="Aptos" w:cs="Times New Roman"/>
+          <w:color w:val="000000" w:themeColor="text1"/>
+        </w:rPr>
+      </w:pPr>
+      <w:r>
+        <w:rPr>
+          <w:rFonts w:ascii="Aptos" w:eastAsia="Aptos Display" w:hAnsi="Aptos" w:cs="Times New Roman"/>
+          <w:color w:val="000000" w:themeColor="text1"/>
+          <w:sz w:val="26"/>
+          <w:szCs w:val="26"/>
+        </w:rPr>
+        <w:t>Average Case</w:t>
+      </w:r>
+      <w:r>
+        <w:rPr>
+          <w:rFonts w:ascii="Aptos" w:eastAsia="Aptos Display" w:hAnsi="Aptos" w:cs="Times New Roman"/>
+          <w:color w:val="000000" w:themeColor="text1"/>
+        </w:rPr>
+        <w:t xml:space="preserve"> </w:t>
+      </w:r>
+    </w:p>
+    <w:p>
+      <w:pPr>
+        <w:rPr>
+          <w:rFonts w:ascii="Aptos" w:eastAsia="Aptos Display" w:hAnsi="Aptos" w:cs="Times New Roman"/>
+          <w:color w:val="000000" w:themeColor="text1"/>
+        </w:rPr>
+      </w:pPr>
+      <w:r>
+        <w:rPr>
+          <w:rFonts w:ascii="Aptos" w:eastAsia="Aptos Display" w:hAnsi="Aptos" w:cs="Times New Roman"/>
+          <w:color w:val="000000" w:themeColor="text1"/>
+        </w:rPr>
+        <w:t>The best algorithm to use with the average case would be Merge Sort. Merge Sort has fewer comparisons on average than Quick Sort and is more predictable, but either algorithm could be used because Quick Sort is in place and the number of comparisons is slightly higher than Merge Sort.</w:t>
+      </w:r>
+    </w:p>
+    <w:p>
+      <w:pPr>
+        <w:rPr>
+          <w:rFonts w:ascii="Aptos" w:eastAsia="Aptos Display" w:hAnsi="Aptos" w:cs="Times New Roman"/>
+          <w:color w:val="000000" w:themeColor="text1"/>
+          <w:sz w:val="26"/>
+          <w:szCs w:val="26"/>
+        </w:rPr>
+      </w:pPr>
+      <w:r>
+        <w:rPr>
+          <w:rFonts w:ascii="Aptos" w:eastAsia="Aptos Display" w:hAnsi="Aptos" w:cs="Times New Roman"/>
+          <w:color w:val="000000" w:themeColor="text1"/>
+          <w:sz w:val="26"/>
+          <w:szCs w:val="26"/>
+        </w:rPr>
+        <w:t>Worst Case</w:t>
+      </w:r>
+    </w:p>
+    <w:p>
+      <w:pPr>
+        <w:rPr>
+          <w:rFonts w:ascii="Aptos" w:eastAsia="Aptos Display" w:hAnsi="Aptos" w:cs="Times New Roman"/>
+          <w:color w:val="000000" w:themeColor="text1"/>
+        </w:rPr>
+      </w:pPr>
+      <w:r>
+        <w:rPr>
+          <w:rFonts w:ascii="Aptos" w:eastAsia="Aptos Display" w:hAnsi="Aptos" w:cs="Times New Roman"/>
+          <w:color w:val="000000" w:themeColor="text1"/>
+        </w:rPr>
+        <w:t xml:space="preserve">The best algorithm to use in the worst case is Merge Sort because it is reliable and predicable. With a </w:t>
+      </w:r>
+      <w:proofErr w:type="gramStart"/>
+      <w:r>
+        <w:rPr>
+          <w:rFonts w:ascii="Aptos" w:eastAsia="Aptos Display" w:hAnsi="Aptos" w:cs="Times New Roman"/>
+          <w:color w:val="000000" w:themeColor="text1"/>
+        </w:rPr>
+        <w:t>time</w:t>
+      </w:r>
+      <w:proofErr w:type="gramEnd"/>
+      <w:r>
+        <w:rPr>
+          <w:rFonts w:ascii="Aptos" w:eastAsia="Aptos Display" w:hAnsi="Aptos" w:cs="Times New Roman"/>
+          <w:color w:val="000000" w:themeColor="text1"/>
+        </w:rPr>
+        <w:t xml:space="preserve"> complexity of </w:t>
+      </w:r>
+      <w:proofErr w:type="spellStart"/>
+      <w:r>
+        <w:rPr>
+          <w:rFonts w:ascii="Aptos" w:eastAsia="Aptos Display" w:hAnsi="Aptos" w:cs="Times New Roman"/>
+          <w:i/>
+          <w:iCs/>
+          <w:color w:val="000000" w:themeColor="text1"/>
+        </w:rPr>
+        <w:t>nlog</w:t>
+      </w:r>
+      <w:proofErr w:type="spellEnd"/>
+      <w:r>
+        <w:rPr>
+          <w:rFonts w:ascii="Aptos" w:eastAsia="Aptos Display" w:hAnsi="Aptos" w:cs="Times New Roman"/>
+          <w:i/>
+          <w:iCs/>
+          <w:color w:val="000000" w:themeColor="text1"/>
+        </w:rPr>
+        <w:t>(n)</w:t>
+      </w:r>
+      <w:r>
+        <w:rPr>
+          <w:rFonts w:ascii="Aptos" w:eastAsia="Aptos Display" w:hAnsi="Aptos" w:cs="Times New Roman"/>
+          <w:color w:val="000000" w:themeColor="text1"/>
+        </w:rPr>
+        <w:t xml:space="preserve"> the Merge Sort algorithm can complete faster than Quick Sort with a time complexity of </w:t>
+      </w:r>
+      <w:r>
+        <w:rPr>
+          <w:rFonts w:ascii="Aptos" w:eastAsia="Aptos Display" w:hAnsi="Aptos" w:cs="Times New Roman"/>
+          <w:i/>
+          <w:iCs/>
+          <w:color w:val="000000" w:themeColor="text1"/>
+        </w:rPr>
+        <w:t>(n</w:t>
+      </w:r>
+      <w:r>
+        <w:rPr>
+          <w:rFonts w:ascii="Aptos" w:eastAsia="Aptos Display" w:hAnsi="Aptos" w:cs="Times New Roman"/>
+          <w:i/>
+          <w:iCs/>
+          <w:color w:val="000000" w:themeColor="text1"/>
+          <w:vertAlign w:val="superscript"/>
+        </w:rPr>
+        <w:t>2</w:t>
+      </w:r>
+      <w:r>
+        <w:rPr>
+          <w:rFonts w:ascii="Aptos" w:eastAsia="Aptos Display" w:hAnsi="Aptos" w:cs="Times New Roman"/>
+          <w:i/>
+          <w:iCs/>
+          <w:color w:val="000000" w:themeColor="text1"/>
+        </w:rPr>
+        <w:t>)</w:t>
+      </w:r>
+      <w:r>
+        <w:rPr>
+          <w:rFonts w:ascii="Aptos" w:eastAsia="Aptos Display" w:hAnsi="Aptos" w:cs="Times New Roman"/>
+          <w:i/>
+          <w:iCs/>
+          <w:color w:val="000000" w:themeColor="text1"/>
+        </w:rPr>
+        <w:t xml:space="preserve"> </w:t>
+      </w:r>
+      <w:r>
+        <w:rPr>
+          <w:rFonts w:ascii="Aptos" w:eastAsia="Aptos Display" w:hAnsi="Aptos" w:cs="Times New Roman"/>
+          <w:color w:val="000000" w:themeColor="text1"/>
+        </w:rPr>
+        <w:t xml:space="preserve">at its worst case. </w:t>
+      </w:r>
+    </w:p>
+    <w:p>
+      <w:pPr>
+        <w:pStyle w:val="Heading3"/>
+      </w:pPr>
+      <w:r>
+        <w:t xml:space="preserve">5 </w:t>
+      </w:r>
+      <w:r>
+        <w:t xml:space="preserve">Project results differential </w:t>
+      </w:r>
+      <w:r>
+        <w:t>–</w:t>
+      </w:r>
+      <w:r>
+        <w:t xml:space="preserve"> Julian</w:t>
+      </w:r>
+    </w:p>
+    <w:p>
+      <w:pPr>
         <w:pStyle w:val="ListParagraph"/>
         <w:numPr>
           <w:ilvl w:val="0"/>
           <w:numId w:val="7"/>
         </w:numPr>
         <w:rPr>
-          <w:rFonts w:ascii="Aptos" w:eastAsia="Aptos Display" w:hAnsi="Aptos" w:cs="Times New Roman"/>
           <w:color w:val="4C94D8" w:themeColor="text2" w:themeTint="80"/>
         </w:rPr>
       </w:pPr>
       <w:r>
         <w:rPr>
-          <w:rFonts w:ascii="Aptos" w:eastAsia="Aptos Display" w:hAnsi="Aptos" w:cs="Times New Roman"/>
           <w:color w:val="4C94D8" w:themeColor="text2" w:themeTint="80"/>
         </w:rPr>
         <w:t>Discuss sensitivity of best/worst cases — is performance stable or highly variable? Use your best/worst spread to justify.</w:t>
@@ -850,19 +1601,19 @@
     </w:p>
     <w:p>
       <w:pPr>
-        <w:pStyle w:val="Heading3"/>
-      </w:pPr>
-      <w:r>
-        <w:t xml:space="preserve">5 </w:t>
-      </w:r>
-      <w:r>
-        <w:t xml:space="preserve">Project results differential </w:t>
+        <w:pStyle w:val="Heading2"/>
+      </w:pPr>
+      <w:r>
+        <w:t>Conclusion</w:t>
+      </w:r>
+      <w:r>
+        <w:t xml:space="preserve"> </w:t>
       </w:r>
       <w:r>
         <w:t>–</w:t>
       </w:r>
       <w:r>
-        <w:t xml:space="preserve"> Julian</w:t>
+        <w:t xml:space="preserve"> Alex</w:t>
       </w:r>
     </w:p>
     <w:p>
@@ -880,24 +1631,7 @@
         <w:rPr>
           <w:color w:val="4C94D8" w:themeColor="text2" w:themeTint="80"/>
         </w:rPr>
-        <w:t>Discuss sensitivity of best/worst cases — is performance stable or highly variable? Use your best/worst spread to justify.</w:t>
-      </w:r>
-    </w:p>
-    <w:p>
-      <w:pPr>
-        <w:pStyle w:val="Heading2"/>
-      </w:pPr>
-      <w:r>
-        <w:t>Conclusion</w:t>
-      </w:r>
-      <w:r>
-        <w:t xml:space="preserve"> </w:t>
-      </w:r>
-      <w:r>
-        <w:t>–</w:t>
-      </w:r>
-      <w:r>
-        <w:t xml:space="preserve"> Alex</w:t>
+        <w:t>What did you learn?</w:t>
       </w:r>
     </w:p>
     <w:p>
@@ -915,7 +1649,24 @@
         <w:rPr>
           <w:color w:val="4C94D8" w:themeColor="text2" w:themeTint="80"/>
         </w:rPr>
-        <w:t>What did you learn?</w:t>
+        <w:t>What surprised you?</w:t>
+      </w:r>
+    </w:p>
+    <w:p>
+      <w:pPr>
+        <w:pStyle w:val="Heading2"/>
+      </w:pPr>
+      <w:r>
+        <w:t>Summary of Work Done / Lessons Learned</w:t>
+      </w:r>
+      <w:r>
+        <w:t xml:space="preserve"> </w:t>
+      </w:r>
+      <w:r>
+        <w:t>–</w:t>
+      </w:r>
+      <w:r>
+        <w:t xml:space="preserve"> Alex</w:t>
       </w:r>
     </w:p>
     <w:p>
@@ -933,42 +1684,6 @@
         <w:rPr>
           <w:color w:val="4C94D8" w:themeColor="text2" w:themeTint="80"/>
         </w:rPr>
-        <w:t>What surprised you?</w:t>
-      </w:r>
-    </w:p>
-    <w:p>
-      <w:pPr>
-        <w:pStyle w:val="Heading2"/>
-      </w:pPr>
-      <w:r>
-        <w:lastRenderedPageBreak/>
-        <w:t>Summary of Work Done / Lessons Learned</w:t>
-      </w:r>
-      <w:r>
-        <w:t xml:space="preserve"> </w:t>
-      </w:r>
-      <w:r>
-        <w:t>–</w:t>
-      </w:r>
-      <w:r>
-        <w:t xml:space="preserve"> Alex</w:t>
-      </w:r>
-    </w:p>
-    <w:p>
-      <w:pPr>
-        <w:pStyle w:val="ListParagraph"/>
-        <w:numPr>
-          <w:ilvl w:val="0"/>
-          <w:numId w:val="7"/>
-        </w:numPr>
-        <w:rPr>
-          <w:color w:val="4C94D8" w:themeColor="text2" w:themeTint="80"/>
-        </w:rPr>
-      </w:pPr>
-      <w:r>
-        <w:rPr>
-          <w:color w:val="4C94D8" w:themeColor="text2" w:themeTint="80"/>
-        </w:rPr>
         <w:t>One short Paragraph</w:t>
       </w:r>
       <w:r>
@@ -1047,7 +1762,6 @@
       <w:bookmarkStart w:id="1" w:name="_Appendix_–_Part"/>
       <w:bookmarkEnd w:id="1"/>
       <w:r>
-        <w:lastRenderedPageBreak/>
         <w:t>Works Cited</w:t>
       </w:r>
     </w:p>
@@ -1055,8 +1769,13 @@
       <w:pPr>
         <w:ind w:left="720" w:hanging="720"/>
       </w:pPr>
-      <w:r>
-        <w:t xml:space="preserve">GeeksforGeeks. (n.d.). </w:t>
+      <w:proofErr w:type="spellStart"/>
+      <w:r>
+        <w:t>GeeksforGeeks</w:t>
+      </w:r>
+      <w:proofErr w:type="spellEnd"/>
+      <w:r>
+        <w:t xml:space="preserve">. (n.d.). </w:t>
       </w:r>
       <w:r>
         <w:rPr>
@@ -1066,7 +1785,15 @@
         <w:t>Cocktail sort algorithm</w:t>
       </w:r>
       <w:r>
-        <w:t xml:space="preserve">. GeeksforGeeks. </w:t>
+        <w:t xml:space="preserve">. </w:t>
+      </w:r>
+      <w:proofErr w:type="spellStart"/>
+      <w:r>
+        <w:t>GeeksforGeeks</w:t>
+      </w:r>
+      <w:proofErr w:type="spellEnd"/>
+      <w:r>
+        <w:t xml:space="preserve">. </w:t>
       </w:r>
       <w:hyperlink r:id="rId5" w:history="1">
         <w:r>
@@ -1107,8 +1834,13 @@
       <w:pPr>
         <w:ind w:left="720" w:hanging="720"/>
       </w:pPr>
-      <w:r>
-        <w:t xml:space="preserve">GeeksforGeeks. (n.d.). </w:t>
+      <w:proofErr w:type="spellStart"/>
+      <w:r>
+        <w:t>GeeksforGeeks</w:t>
+      </w:r>
+      <w:proofErr w:type="spellEnd"/>
+      <w:r>
+        <w:t xml:space="preserve">. (n.d.). </w:t>
       </w:r>
       <w:r>
         <w:rPr>
@@ -1118,7 +1850,15 @@
         <w:t>Heap sort algorithm</w:t>
       </w:r>
       <w:r>
-        <w:t xml:space="preserve">. GeeksforGeeks. </w:t>
+        <w:t xml:space="preserve">. </w:t>
+      </w:r>
+      <w:proofErr w:type="spellStart"/>
+      <w:r>
+        <w:t>GeeksforGeeks</w:t>
+      </w:r>
+      <w:proofErr w:type="spellEnd"/>
+      <w:r>
+        <w:t xml:space="preserve">. </w:t>
       </w:r>
       <w:hyperlink r:id="rId7" w:history="1">
         <w:r>
@@ -2827,6 +3567,7 @@
   <w:style w:type="character" w:default="1" w:styleId="DefaultParagraphFont">
     <w:name w:val="Default Paragraph Font"/>
     <w:uiPriority w:val="1"/>
+    <w:semiHidden/>
     <w:unhideWhenUsed/>
   </w:style>
   <w:style w:type="table" w:default="1" w:styleId="TableNormal">

</xml_diff>

<commit_message>
Added conclusion and lessons learned
</commit_message>
<xml_diff>
--- a/docs/Programming Project 2 Report.docx
+++ b/docs/Programming Project 2 Report.docx
@@ -23,7 +23,7 @@
         <w:jc w:val="center"/>
       </w:pPr>
       <w:r>
-        <w:t>Set Operations</w:t>
+        <w:t>Algorithm Performance</w:t>
       </w:r>
     </w:p>
     <w:p/>
@@ -69,15 +69,6 @@
       <w:r>
         <w:lastRenderedPageBreak/>
         <w:t>Introduction</w:t>
-      </w:r>
-      <w:r>
-        <w:t xml:space="preserve"> </w:t>
-      </w:r>
-      <w:r>
-        <w:t>–</w:t>
-      </w:r>
-      <w:r>
-        <w:t xml:space="preserve"> Alex</w:t>
       </w:r>
     </w:p>
     <w:p>
@@ -226,6 +217,7 @@
       <w:r>
         <w:t xml:space="preserve">a </w:t>
       </w:r>
+      <w:proofErr w:type="gramStart"/>
       <w:r>
         <w:t xml:space="preserve">arrays of </w:t>
       </w:r>
@@ -233,7 +225,11 @@
         <w:t>1</w:t>
       </w:r>
       <w:r>
-        <w:t xml:space="preserve"> item, then of </w:t>
+        <w:t xml:space="preserve"> item</w:t>
+      </w:r>
+      <w:proofErr w:type="gramEnd"/>
+      <w:r>
+        <w:t xml:space="preserve">, then of </w:t>
       </w:r>
       <w:r>
         <w:t>2</w:t>
@@ -245,7 +241,15 @@
         <w:t>4</w:t>
       </w:r>
       <w:r>
-        <w:t xml:space="preserve"> items, etc., until the original halves of the array are sorted and merged, producing a fully sorted array</w:t>
+        <w:t xml:space="preserve"> items, etc., until the original halves of the array </w:t>
+      </w:r>
+      <w:proofErr w:type="gramStart"/>
+      <w:r>
+        <w:t>are</w:t>
+      </w:r>
+      <w:proofErr w:type="gramEnd"/>
+      <w:r>
+        <w:t xml:space="preserve"> sorted and merged, producing a fully sorted array</w:t>
       </w:r>
       <w:r>
         <w:t xml:space="preserve"> </w:t>
@@ -281,7 +285,31 @@
         <w:t xml:space="preserve"> works by </w:t>
       </w:r>
       <w:r>
-        <w:t>choosing an element in the array as a partition element and passing through the array from both ends, swapping an item from the right with an item from the left if those items are out of order when compared to the partition element (ex: if the partition element p = 5, and passing through the array from left to right finds an element i = 6 and passing through the array from right to left finds an element j = 2, i and j are swapped). This loop is completed until the index i moving from left to right passes the index j moving from right to left, at which point the partition element is placed at the crossing point. This process means all values less than p are to the left of p in the array, and all values larger are to the right of p. The process is then applied to the unsorted left and right halves recursively until the entire array is sorted</w:t>
+        <w:t xml:space="preserve">choosing an element in the array as a partition element and passing through the array from both ends, swapping an item from the right with an item from the left if those items are out of order when compared to the partition element (ex: if the partition element p = 5, and passing through the array from left to right finds an element </w:t>
+      </w:r>
+      <w:proofErr w:type="spellStart"/>
+      <w:r>
+        <w:t>i</w:t>
+      </w:r>
+      <w:proofErr w:type="spellEnd"/>
+      <w:r>
+        <w:t xml:space="preserve"> = 6 and passing through the array from right to left finds an element j = 2, </w:t>
+      </w:r>
+      <w:proofErr w:type="spellStart"/>
+      <w:r>
+        <w:t>i</w:t>
+      </w:r>
+      <w:proofErr w:type="spellEnd"/>
+      <w:r>
+        <w:t xml:space="preserve"> and j are swapped). This loop is completed until the index </w:t>
+      </w:r>
+      <w:proofErr w:type="spellStart"/>
+      <w:r>
+        <w:t>i</w:t>
+      </w:r>
+      <w:proofErr w:type="spellEnd"/>
+      <w:r>
+        <w:t xml:space="preserve"> moving from left to right passes the index j moving from right to left, at which point the partition element is placed at the crossing point. This process means all values less than p are to the left of p in the array, and all values larger are to the right of p. The process is then applied to the unsorted left and right halves recursively until the entire array is sorted</w:t>
       </w:r>
       <w:r>
         <w:t xml:space="preserve"> </w:t>
@@ -318,7 +346,15 @@
       </w:r>
       <w:r>
         <w:lastRenderedPageBreak/>
-        <w:t>otherwise advances to the next element. At the end of the first rightward pass, the largest element is in the right-most position. On leftward passes, the smaller elements are shifted left, so at the end of the first leftward pass the smallest element is the left-most position. The remaining portion of the array to be sorted is then iterated on until a pass results in no swaps</w:t>
+        <w:t xml:space="preserve">otherwise advances to the next element. At the end of the first rightward pass, the largest element is in the right-most position. On leftward passes, the smaller elements are shifted left, so at the end of the first leftward pass the smallest element is the left-most position. The remaining portion of the array to be sorted is then iterated on until a </w:t>
+      </w:r>
+      <w:proofErr w:type="gramStart"/>
+      <w:r>
+        <w:t>pass results</w:t>
+      </w:r>
+      <w:proofErr w:type="gramEnd"/>
+      <w:r>
+        <w:t xml:space="preserve"> in no swaps</w:t>
       </w:r>
       <w:r>
         <w:t xml:space="preserve"> </w:t>
@@ -348,13 +384,29 @@
         <w:t>ordering</w:t>
       </w:r>
       <w:r>
-        <w:t xml:space="preserve"> the array into a binary heap, then subsequently sorting the array into either ascending or descending order (depending if the heap is maximum- or minimum-oriented) until </w:t>
+        <w:t xml:space="preserve"> the array into a binary heap, then subsequently sorting the array into either ascending or descending order (</w:t>
+      </w:r>
+      <w:proofErr w:type="gramStart"/>
+      <w:r>
+        <w:t>depending</w:t>
+      </w:r>
+      <w:proofErr w:type="gramEnd"/>
+      <w:r>
+        <w:t xml:space="preserve"> if the heap is maximum- or minimum-oriented) until </w:t>
       </w:r>
       <w:r>
         <w:t xml:space="preserve">the array is fully sorted. </w:t>
       </w:r>
       <w:r>
-        <w:t>This is accomplished by swapping the first element of the heap with the last element, reducing the heap size by one (the now sorted last element), re-heapifying the remaining unsorted elements by sinking the new first element to its proper position, and repeating the process on the new heap until the heap size is one</w:t>
+        <w:t>This is accomplished by swapping the first element of the heap with the last element, reducing the heap size by one (the now sorted last element), re-</w:t>
+      </w:r>
+      <w:proofErr w:type="spellStart"/>
+      <w:r>
+        <w:t>heapifying</w:t>
+      </w:r>
+      <w:proofErr w:type="spellEnd"/>
+      <w:r>
+        <w:t xml:space="preserve"> the remaining unsorted elements by sinking the new first element to its proper position, and repeating the process on the new heap until the heap size is one</w:t>
       </w:r>
       <w:r>
         <w:t xml:space="preserve"> </w:t>
@@ -432,7 +484,15 @@
     </w:p>
     <w:p>
       <w:r>
-        <w:t xml:space="preserve">A standard measure of performance is required in order to compare the algorithms fairly. Performance measures like </w:t>
+        <w:t xml:space="preserve">A standard measure of performance is required </w:t>
+      </w:r>
+      <w:proofErr w:type="gramStart"/>
+      <w:r>
+        <w:t>in order to</w:t>
+      </w:r>
+      <w:proofErr w:type="gramEnd"/>
+      <w:r>
+        <w:t xml:space="preserve"> compare the algorithms fairly. Performance measures like </w:t>
       </w:r>
       <w:r>
         <w:rPr>
@@ -578,6 +638,7 @@
         </w:rPr>
         <w:t xml:space="preserve">Merge Sort is always </w:t>
       </w:r>
+      <w:proofErr w:type="spellStart"/>
       <w:r>
         <w:rPr>
           <w:rFonts w:eastAsia="Aptos Display" w:cs="Times New Roman"/>
@@ -585,15 +646,9 @@
           <w:iCs/>
           <w:color w:val="000000" w:themeColor="text1"/>
         </w:rPr>
-        <w:t>nlog(n)</w:t>
-      </w:r>
-      <w:r>
-        <w:rPr>
-          <w:rFonts w:eastAsia="Aptos Display" w:cs="Times New Roman"/>
-          <w:color w:val="000000" w:themeColor="text1"/>
-        </w:rPr>
-        <w:t xml:space="preserve"> because the algorithm recursively divides the array in half with a total tree length of </w:t>
-      </w:r>
+        <w:t>nlog</w:t>
+      </w:r>
+      <w:proofErr w:type="spellEnd"/>
       <w:r>
         <w:rPr>
           <w:rFonts w:eastAsia="Aptos Display" w:cs="Times New Roman"/>
@@ -601,6 +656,22 @@
           <w:iCs/>
           <w:color w:val="000000" w:themeColor="text1"/>
         </w:rPr>
+        <w:t>(n)</w:t>
+      </w:r>
+      <w:r>
+        <w:rPr>
+          <w:rFonts w:eastAsia="Aptos Display" w:cs="Times New Roman"/>
+          <w:color w:val="000000" w:themeColor="text1"/>
+        </w:rPr>
+        <w:t xml:space="preserve"> because the algorithm recursively divides the array in half with a total tree length of </w:t>
+      </w:r>
+      <w:r>
+        <w:rPr>
+          <w:rFonts w:eastAsia="Aptos Display" w:cs="Times New Roman"/>
+          <w:i/>
+          <w:iCs/>
+          <w:color w:val="000000" w:themeColor="text1"/>
+        </w:rPr>
         <w:t>log(n)</w:t>
       </w:r>
       <w:r>
@@ -696,6 +767,7 @@
         </w:rPr>
         <w:t xml:space="preserve"> </w:t>
       </w:r>
+      <w:proofErr w:type="spellStart"/>
       <w:r>
         <w:rPr>
           <w:rFonts w:eastAsia="Aptos Display" w:cs="Times New Roman"/>
@@ -703,15 +775,9 @@
           <w:iCs/>
           <w:color w:val="000000" w:themeColor="text1"/>
         </w:rPr>
-        <w:t>nlog(n)</w:t>
-      </w:r>
-      <w:r>
-        <w:rPr>
-          <w:rFonts w:eastAsia="Aptos Display" w:cs="Times New Roman"/>
-          <w:color w:val="000000" w:themeColor="text1"/>
-        </w:rPr>
-        <w:t xml:space="preserve">. Although the Big-O time complexity is </w:t>
-      </w:r>
+        <w:t>nlog</w:t>
+      </w:r>
+      <w:proofErr w:type="spellEnd"/>
       <w:r>
         <w:rPr>
           <w:rFonts w:eastAsia="Aptos Display" w:cs="Times New Roman"/>
@@ -719,7 +785,14 @@
           <w:iCs/>
           <w:color w:val="000000" w:themeColor="text1"/>
         </w:rPr>
-        <w:t>n</w:t>
+        <w:t>(n)</w:t>
+      </w:r>
+      <w:r>
+        <w:rPr>
+          <w:rFonts w:eastAsia="Aptos Display" w:cs="Times New Roman"/>
+          <w:color w:val="000000" w:themeColor="text1"/>
+        </w:rPr>
+        <w:t xml:space="preserve">. Although the Big-O time complexity is </w:t>
       </w:r>
       <w:r>
         <w:rPr>
@@ -727,16 +800,8 @@
           <w:i/>
           <w:iCs/>
           <w:color w:val="000000" w:themeColor="text1"/>
-          <w:vertAlign w:val="superscript"/>
-        </w:rPr>
-        <w:t>2</w:t>
-      </w:r>
-      <w:r>
-        <w:rPr>
-          <w:rFonts w:eastAsia="Aptos Display" w:cs="Times New Roman"/>
-          <w:color w:val="000000" w:themeColor="text1"/>
-        </w:rPr>
-        <w:t xml:space="preserve">, this is only for the worst-case scenario and is </w:t>
+        </w:rPr>
+        <w:t>n</w:t>
       </w:r>
       <w:r>
         <w:rPr>
@@ -744,43 +809,28 @@
           <w:i/>
           <w:iCs/>
           <w:color w:val="000000" w:themeColor="text1"/>
-        </w:rPr>
-        <w:t>nlog(n)</w:t>
-      </w:r>
+          <w:vertAlign w:val="superscript"/>
+        </w:rPr>
+        <w:t>2</w:t>
+      </w:r>
+      <w:r>
+        <w:rPr>
+          <w:rFonts w:eastAsia="Aptos Display" w:cs="Times New Roman"/>
+          <w:color w:val="000000" w:themeColor="text1"/>
+        </w:rPr>
+        <w:t xml:space="preserve">, this is only for the worst-case scenario and is </w:t>
+      </w:r>
+      <w:proofErr w:type="spellStart"/>
       <w:r>
         <w:rPr>
           <w:rFonts w:eastAsia="Aptos Display" w:cs="Times New Roman"/>
           <w:i/>
           <w:iCs/>
           <w:color w:val="000000" w:themeColor="text1"/>
-          <w:vertAlign w:val="superscript"/>
-        </w:rPr>
-        <w:t xml:space="preserve"> </w:t>
-      </w:r>
-      <w:r>
-        <w:rPr>
-          <w:rFonts w:eastAsia="Aptos Display" w:cs="Times New Roman"/>
-          <w:color w:val="000000" w:themeColor="text1"/>
-        </w:rPr>
-        <w:t>on every other account, resulting in Big-</w:t>
-      </w:r>
-      <w:r>
-        <w:t xml:space="preserve"> </w:t>
-      </w:r>
-      <w:r>
-        <w:rPr>
-          <w:rFonts w:eastAsia="Aptos Display" w:cs="Times New Roman"/>
-          <w:color w:val="000000" w:themeColor="text1"/>
-        </w:rPr>
-        <w:t>Θ</w:t>
-      </w:r>
-      <w:r>
-        <w:rPr>
-          <w:rFonts w:eastAsia="Aptos Display" w:cs="Times New Roman"/>
-          <w:color w:val="000000" w:themeColor="text1"/>
-        </w:rPr>
-        <w:t xml:space="preserve"> complexity of </w:t>
-      </w:r>
+        </w:rPr>
+        <w:t>nlog</w:t>
+      </w:r>
+      <w:proofErr w:type="spellEnd"/>
       <w:r>
         <w:rPr>
           <w:rFonts w:eastAsia="Aptos Display" w:cs="Times New Roman"/>
@@ -788,7 +838,61 @@
           <w:iCs/>
           <w:color w:val="000000" w:themeColor="text1"/>
         </w:rPr>
-        <w:t>nlog(n)</w:t>
+        <w:t>(n)</w:t>
+      </w:r>
+      <w:r>
+        <w:rPr>
+          <w:rFonts w:eastAsia="Aptos Display" w:cs="Times New Roman"/>
+          <w:i/>
+          <w:iCs/>
+          <w:color w:val="000000" w:themeColor="text1"/>
+          <w:vertAlign w:val="superscript"/>
+        </w:rPr>
+        <w:t xml:space="preserve"> </w:t>
+      </w:r>
+      <w:r>
+        <w:rPr>
+          <w:rFonts w:eastAsia="Aptos Display" w:cs="Times New Roman"/>
+          <w:color w:val="000000" w:themeColor="text1"/>
+        </w:rPr>
+        <w:t>on every other account, resulting in Big-</w:t>
+      </w:r>
+      <w:r>
+        <w:t xml:space="preserve"> </w:t>
+      </w:r>
+      <w:r>
+        <w:rPr>
+          <w:rFonts w:eastAsia="Aptos Display" w:cs="Times New Roman"/>
+          <w:color w:val="000000" w:themeColor="text1"/>
+        </w:rPr>
+        <w:t>Θ</w:t>
+      </w:r>
+      <w:r>
+        <w:rPr>
+          <w:rFonts w:eastAsia="Aptos Display" w:cs="Times New Roman"/>
+          <w:color w:val="000000" w:themeColor="text1"/>
+        </w:rPr>
+        <w:t xml:space="preserve"> complexity of </w:t>
+      </w:r>
+      <w:proofErr w:type="spellStart"/>
+      <w:r>
+        <w:rPr>
+          <w:rFonts w:eastAsia="Aptos Display" w:cs="Times New Roman"/>
+          <w:i/>
+          <w:iCs/>
+          <w:color w:val="000000" w:themeColor="text1"/>
+        </w:rPr>
+        <w:t>nlog</w:t>
+      </w:r>
+      <w:proofErr w:type="spellEnd"/>
+      <w:r>
+        <w:rPr>
+          <w:rFonts w:eastAsia="Aptos Display" w:cs="Times New Roman"/>
+          <w:i/>
+          <w:iCs/>
+          <w:color w:val="000000" w:themeColor="text1"/>
+        </w:rPr>
+        <w:t>(n)</w:t>
       </w:r>
       <w:r>
         <w:rPr>
@@ -962,8 +1066,25 @@
           <w:rFonts w:eastAsia="Aptos Display" w:cs="Times New Roman"/>
           <w:color w:val="000000" w:themeColor="text1"/>
         </w:rPr>
-        <w:t xml:space="preserve"> increases, the number of times the algorithm must go through its branches and rearrange, as well as remove the maximum element to sort increases. Another element must be heapified and then arranged when sorting. Because the program must go through the entire heap multiple times to sort, it results in time </w:t>
-      </w:r>
+        <w:t xml:space="preserve"> increases, the number of times the algorithm must go through its branches and rearrange, as well as remove the maximum element to sort increases. Another element must be </w:t>
+      </w:r>
+      <w:proofErr w:type="spellStart"/>
+      <w:r>
+        <w:rPr>
+          <w:rFonts w:eastAsia="Aptos Display" w:cs="Times New Roman"/>
+          <w:color w:val="000000" w:themeColor="text1"/>
+        </w:rPr>
+        <w:t>heapified</w:t>
+      </w:r>
+      <w:proofErr w:type="spellEnd"/>
+      <w:r>
+        <w:rPr>
+          <w:rFonts w:eastAsia="Aptos Display" w:cs="Times New Roman"/>
+          <w:color w:val="000000" w:themeColor="text1"/>
+        </w:rPr>
+        <w:t xml:space="preserve"> and then arranged when sorting. Because the program must go through the entire heap multiple times to sort, it results in time </w:t>
+      </w:r>
+      <w:proofErr w:type="spellStart"/>
       <w:r>
         <w:rPr>
           <w:rFonts w:eastAsia="Aptos Display" w:cs="Times New Roman"/>
@@ -971,7 +1092,17 @@
           <w:iCs/>
           <w:color w:val="000000" w:themeColor="text1"/>
         </w:rPr>
-        <w:t>nlog(n)</w:t>
+        <w:t>nlog</w:t>
+      </w:r>
+      <w:proofErr w:type="spellEnd"/>
+      <w:r>
+        <w:rPr>
+          <w:rFonts w:eastAsia="Aptos Display" w:cs="Times New Roman"/>
+          <w:i/>
+          <w:iCs/>
+          <w:color w:val="000000" w:themeColor="text1"/>
+        </w:rPr>
+        <w:t>(n)</w:t>
       </w:r>
       <w:r>
         <w:rPr>
@@ -1264,39 +1395,103 @@
       </w:r>
     </w:p>
     <w:p>
-      <w:pPr>
-        <w:pStyle w:val="ListParagraph"/>
-        <w:numPr>
-          <w:ilvl w:val="0"/>
-          <w:numId w:val="7"/>
-        </w:numPr>
-        <w:rPr>
-          <w:color w:val="4C94D8" w:themeColor="text2" w:themeTint="80"/>
-        </w:rPr>
-      </w:pPr>
-      <w:r>
-        <w:rPr>
-          <w:color w:val="4C94D8" w:themeColor="text2" w:themeTint="80"/>
-        </w:rPr>
-        <w:t>What did you learn?</w:t>
-      </w:r>
-    </w:p>
-    <w:p>
-      <w:pPr>
-        <w:pStyle w:val="ListParagraph"/>
-        <w:numPr>
-          <w:ilvl w:val="0"/>
-          <w:numId w:val="7"/>
-        </w:numPr>
-        <w:rPr>
-          <w:color w:val="4C94D8" w:themeColor="text2" w:themeTint="80"/>
-        </w:rPr>
-      </w:pPr>
-      <w:r>
-        <w:rPr>
-          <w:color w:val="4C94D8" w:themeColor="text2" w:themeTint="80"/>
-        </w:rPr>
-        <w:t>What surprised you?</w:t>
+      <w:r>
+        <w:t xml:space="preserve">While the time complexity advantages of a particular sorting algorithm can be reasoned through by reading the implementation code, the empirical evidence of this project clearly demonstrates the superiority of Merge Sort from the four algorithms tested, with Quick Sort a close second. The spread </w:t>
+      </w:r>
+      <w:r>
+        <w:t>from</w:t>
+      </w:r>
+      <w:r>
+        <w:t xml:space="preserve"> these two</w:t>
+      </w:r>
+      <w:r>
+        <w:t xml:space="preserve"> </w:t>
+      </w:r>
+      <w:proofErr w:type="spellStart"/>
+      <w:r>
+        <w:t>algorthims</w:t>
+      </w:r>
+      <w:proofErr w:type="spellEnd"/>
+      <w:r>
+        <w:t xml:space="preserve"> </w:t>
+      </w:r>
+      <w:r>
+        <w:t>to</w:t>
+      </w:r>
+      <w:r>
+        <w:t xml:space="preserve"> Heap Sort and Shaker Sort was higher than might </w:t>
+      </w:r>
+      <w:r>
+        <w:t xml:space="preserve">generally be understood or expected without careful </w:t>
+      </w:r>
+      <w:proofErr w:type="gramStart"/>
+      <w:r>
+        <w:t>analysis, and</w:t>
+      </w:r>
+      <w:proofErr w:type="gramEnd"/>
+      <w:r>
+        <w:t xml:space="preserve"> clearly demonstrates the importance of sorting methodology for real-world applications. </w:t>
+      </w:r>
+      <w:r>
+        <w:t xml:space="preserve">Additionally, the variability between best and worst case makes Merge Sort the standout winner compared to the other algorithms considered, with its worst case for n = 8 nearly matching the average case of the next-best performance, Quick Sort. </w:t>
+      </w:r>
+    </w:p>
+    <w:p>
+      <w:r>
+        <w:t>Although permutation generation</w:t>
+      </w:r>
+      <w:r>
+        <w:t xml:space="preserve"> was not the </w:t>
+      </w:r>
+      <w:proofErr w:type="gramStart"/>
+      <w:r>
+        <w:t>main focus</w:t>
+      </w:r>
+      <w:proofErr w:type="gramEnd"/>
+      <w:r>
+        <w:t xml:space="preserve"> of this </w:t>
+      </w:r>
+      <w:r>
+        <w:t>project</w:t>
+      </w:r>
+      <w:r>
+        <w:t xml:space="preserve">, it was a key element of the </w:t>
+      </w:r>
+      <w:r>
+        <w:t>experiment</w:t>
+      </w:r>
+      <w:r>
+        <w:t xml:space="preserve"> that </w:t>
+      </w:r>
+      <w:r>
+        <w:t>should</w:t>
+      </w:r>
+      <w:r>
+        <w:t xml:space="preserve"> not be overlooked. Heap’s Algorithm for permuting arrays turned out to be an</w:t>
+      </w:r>
+      <w:r>
+        <w:t xml:space="preserve"> </w:t>
+      </w:r>
+      <w:r>
+        <w:t xml:space="preserve">interesting and </w:t>
+      </w:r>
+      <w:r>
+        <w:t>elegant</w:t>
+      </w:r>
+      <w:r>
+        <w:t xml:space="preserve"> implementation</w:t>
+      </w:r>
+      <w:r>
+        <w:t>. It is much less</w:t>
+      </w:r>
+      <w:r>
+        <w:t xml:space="preserve"> intuitive than typical recursive techniques, </w:t>
+      </w:r>
+      <w:r>
+        <w:t>and</w:t>
+      </w:r>
+      <w:r>
+        <w:t xml:space="preserve"> Robert Sedgewick in 1977 acknowledged that an optimized version of Heap’s Algorithm was the fastest available technique for permutation generation on most computers (Sedgewick, 1977, p. 163). </w:t>
       </w:r>
     </w:p>
     <w:p>
@@ -1304,97 +1499,75 @@
         <w:pStyle w:val="Heading2"/>
       </w:pPr>
       <w:r>
+        <w:lastRenderedPageBreak/>
         <w:t>Summary of Work Done / Lessons Learned</w:t>
       </w:r>
-      <w:r>
-        <w:t xml:space="preserve"> </w:t>
-      </w:r>
-      <w:r>
-        <w:t>–</w:t>
-      </w:r>
-      <w:r>
-        <w:t xml:space="preserve"> Alex</w:t>
-      </w:r>
-    </w:p>
-    <w:p>
-      <w:pPr>
-        <w:pStyle w:val="ListParagraph"/>
-        <w:numPr>
-          <w:ilvl w:val="0"/>
-          <w:numId w:val="7"/>
-        </w:numPr>
-        <w:rPr>
-          <w:color w:val="4C94D8" w:themeColor="text2" w:themeTint="80"/>
-        </w:rPr>
-      </w:pPr>
-      <w:r>
-        <w:rPr>
-          <w:color w:val="4C94D8" w:themeColor="text2" w:themeTint="80"/>
-        </w:rPr>
-        <w:t>One short Paragraph</w:t>
-      </w:r>
-      <w:r>
-        <w:rPr>
-          <w:color w:val="4C94D8" w:themeColor="text2" w:themeTint="80"/>
-        </w:rPr>
-        <w:t xml:space="preserve"> including:</w:t>
-      </w:r>
-    </w:p>
-    <w:p>
-      <w:pPr>
-        <w:pStyle w:val="ListParagraph"/>
-        <w:numPr>
-          <w:ilvl w:val="1"/>
-          <w:numId w:val="7"/>
-        </w:numPr>
-        <w:rPr>
-          <w:color w:val="4C94D8" w:themeColor="text2" w:themeTint="80"/>
-        </w:rPr>
-      </w:pPr>
-      <w:r>
-        <w:rPr>
-          <w:color w:val="4C94D8" w:themeColor="text2" w:themeTint="80"/>
-        </w:rPr>
-        <w:t>Tools used</w:t>
-      </w:r>
-    </w:p>
-    <w:p>
-      <w:pPr>
-        <w:pStyle w:val="ListParagraph"/>
-        <w:numPr>
-          <w:ilvl w:val="1"/>
-          <w:numId w:val="7"/>
-        </w:numPr>
-        <w:rPr>
-          <w:color w:val="4C94D8" w:themeColor="text2" w:themeTint="80"/>
-        </w:rPr>
-      </w:pPr>
-      <w:r>
-        <w:rPr>
-          <w:color w:val="4C94D8" w:themeColor="text2" w:themeTint="80"/>
-        </w:rPr>
-        <w:t>Obstacles</w:t>
-      </w:r>
-    </w:p>
-    <w:p>
-      <w:pPr>
-        <w:pStyle w:val="ListParagraph"/>
-        <w:numPr>
-          <w:ilvl w:val="1"/>
-          <w:numId w:val="7"/>
-        </w:numPr>
-        <w:rPr>
-          <w:color w:val="4C94D8" w:themeColor="text2" w:themeTint="80"/>
-        </w:rPr>
-      </w:pPr>
-      <w:r>
-        <w:rPr>
-          <w:color w:val="4C94D8" w:themeColor="text2" w:themeTint="80"/>
-        </w:rPr>
-        <w:t>Improvements</w:t>
-      </w:r>
-    </w:p>
-    <w:p/>
+    </w:p>
+    <w:p>
+      <w:r>
+        <w:t xml:space="preserve">Over the course of his project, the team implemented a program to test the performance of four sorting algorithms. The code implementation used built-in comparison counters, a permutation generator to create and store all permutations of arrays of size n, and a custom </w:t>
+      </w:r>
+      <w:r>
+        <w:t>`</w:t>
+      </w:r>
+      <w:proofErr w:type="spellStart"/>
+      <w:r>
+        <w:t>SortResult</w:t>
+      </w:r>
+      <w:proofErr w:type="spellEnd"/>
+      <w:r>
+        <w:t>`</w:t>
+      </w:r>
+      <w:r>
+        <w:t xml:space="preserve"> data object to store results so they could be analyzed in a Stream. The team managed workflows through a shared GitHub repository with a </w:t>
+      </w:r>
+      <w:r>
+        <w:t>`</w:t>
+      </w:r>
+      <w:r>
+        <w:t>/docs</w:t>
+      </w:r>
+      <w:r>
+        <w:t>`</w:t>
+      </w:r>
+      <w:r>
+        <w:t xml:space="preserve"> folder for project plans, reports, and other non-code artifacts, and a </w:t>
+      </w:r>
+      <w:r>
+        <w:t>`</w:t>
+      </w:r>
+      <w:r>
+        <w:t>/</w:t>
+      </w:r>
+      <w:proofErr w:type="spellStart"/>
+      <w:r>
+        <w:t>src</w:t>
+      </w:r>
+      <w:proofErr w:type="spellEnd"/>
+      <w:r>
+        <w:t>`</w:t>
+      </w:r>
+      <w:r>
+        <w:t xml:space="preserve"> folder to manage code. </w:t>
+      </w:r>
+    </w:p>
+    <w:p>
+      <w:r>
+        <w:t xml:space="preserve">Building on the experience of the first project, the team maintained a steady meeting cadence and pace of work, adhered to deadlines, and was mutually respectful </w:t>
+      </w:r>
+      <w:r>
+        <w:t>and professional</w:t>
+      </w:r>
+      <w:r>
+        <w:t xml:space="preserve">. With careful planning, the team was able to complete the project on </w:t>
+      </w:r>
+      <w:r>
+        <w:t>time</w:t>
+      </w:r>
+      <w:r>
+        <w:t xml:space="preserve"> and meet all the requirements of the planned scope.</w:t>
+      </w:r>
+    </w:p>
     <w:p>
       <w:r>
         <w:br w:type="page"/>
@@ -1417,8 +1590,13 @@
       <w:pPr>
         <w:ind w:left="720" w:hanging="720"/>
       </w:pPr>
-      <w:r>
-        <w:t xml:space="preserve">GeeksforGeeks. (n.d.). </w:t>
+      <w:proofErr w:type="spellStart"/>
+      <w:r>
+        <w:t>GeeksforGeeks</w:t>
+      </w:r>
+      <w:proofErr w:type="spellEnd"/>
+      <w:r>
+        <w:t xml:space="preserve">. (n.d.). </w:t>
       </w:r>
       <w:r>
         <w:rPr>
@@ -1428,7 +1606,15 @@
         <w:t>Cocktail sort algorithm</w:t>
       </w:r>
       <w:r>
-        <w:t xml:space="preserve">. GeeksforGeeks. </w:t>
+        <w:t xml:space="preserve">. </w:t>
+      </w:r>
+      <w:proofErr w:type="spellStart"/>
+      <w:r>
+        <w:t>GeeksforGeeks</w:t>
+      </w:r>
+      <w:proofErr w:type="spellEnd"/>
+      <w:r>
+        <w:t xml:space="preserve">. </w:t>
       </w:r>
       <w:hyperlink r:id="rId5" w:history="1">
         <w:r>
@@ -1469,8 +1655,13 @@
       <w:pPr>
         <w:ind w:left="720" w:hanging="720"/>
       </w:pPr>
-      <w:r>
-        <w:t xml:space="preserve">GeeksforGeeks. (n.d.). </w:t>
+      <w:proofErr w:type="spellStart"/>
+      <w:r>
+        <w:t>GeeksforGeeks</w:t>
+      </w:r>
+      <w:proofErr w:type="spellEnd"/>
+      <w:r>
+        <w:t xml:space="preserve">. (n.d.). </w:t>
       </w:r>
       <w:r>
         <w:rPr>
@@ -1480,7 +1671,15 @@
         <w:t>Heap sort algorithm</w:t>
       </w:r>
       <w:r>
-        <w:t xml:space="preserve">. GeeksforGeeks. </w:t>
+        <w:t xml:space="preserve">. </w:t>
+      </w:r>
+      <w:proofErr w:type="spellStart"/>
+      <w:r>
+        <w:t>GeeksforGeeks</w:t>
+      </w:r>
+      <w:proofErr w:type="spellEnd"/>
+      <w:r>
+        <w:t xml:space="preserve">. </w:t>
       </w:r>
       <w:hyperlink r:id="rId7" w:history="1">
         <w:r>
@@ -1538,6 +1737,37 @@
         <w:noBreakHyphen/>
         <w:t>Wesley.</w:t>
       </w:r>
+    </w:p>
+    <w:p>
+      <w:pPr>
+        <w:ind w:left="720" w:hanging="720"/>
+      </w:pPr>
+      <w:r>
+        <w:t xml:space="preserve">Sedgewick, R. (1977). </w:t>
+      </w:r>
+      <w:r>
+        <w:rPr>
+          <w:i/>
+          <w:iCs/>
+        </w:rPr>
+        <w:t>Permutation generation methods</w:t>
+      </w:r>
+      <w:r>
+        <w:t xml:space="preserve">. ACM Computing Surveys, 9(2), 137–164. </w:t>
+      </w:r>
+      <w:hyperlink r:id="rId9" w:history="1">
+        <w:r>
+          <w:rPr>
+            <w:rStyle w:val="Hyperlink"/>
+          </w:rPr>
+          <w:t>https://doi.org/10.1145/356689.356692</w:t>
+        </w:r>
+      </w:hyperlink>
+    </w:p>
+    <w:p>
+      <w:pPr>
+        <w:ind w:left="720" w:hanging="720"/>
+      </w:pPr>
     </w:p>
     <w:p>
       <w:pPr>
@@ -3189,7 +3419,6 @@
   <w:style w:type="character" w:default="1" w:styleId="DefaultParagraphFont">
     <w:name w:val="Default Paragraph Font"/>
     <w:uiPriority w:val="1"/>
-    <w:semiHidden/>
     <w:unhideWhenUsed/>
   </w:style>
   <w:style w:type="table" w:default="1" w:styleId="TableNormal">

</xml_diff>